<commit_message>
docs: aplicar diseño corporativo con ambos logos a propuesta v2
</commit_message>
<xml_diff>
--- a/Propuestas/Formalizacion/Propuesta_Motor_Analisis_Portal_APEX_Occidente_v2.0.docx
+++ b/Propuestas/Formalizacion/Propuesta_Motor_Analisis_Portal_APEX_Occidente_v2.0.docx
@@ -72,10 +72,10 @@
         </w:tblBorders>
       </w:tblPr>
       <w:tblGrid>
-        <w:gridCol w:w="4032"/>
-        <w:gridCol w:w="2016"/>
-        <w:gridCol w:w="1872"/>
-        <w:gridCol w:w="2160"/>
+        <w:gridCol w:w="3974"/>
+        <w:gridCol w:w="1987"/>
+        <w:gridCol w:w="1845"/>
+        <w:gridCol w:w="2129"/>
       </w:tblGrid>
       <w:tr>
         <w:trPr>
@@ -84,24 +84,28 @@
         </w:trPr>
         <w:tc>
           <w:tcPr>
-            <w:tcW w:type="dxa" w:w="4032"/>
+            <w:tcW w:type="dxa" w:w="3974"/>
             <w:vAlign w:val="center"/>
-            <w:shd w:fill="DCE6ED"/>
+            <w:shd w:fill="242021"/>
             <w:tcMar>
               <w:top w:w="85" w:type="dxa"/>
               <w:left w:w="85" w:type="dxa"/>
               <w:bottom w:w="85" w:type="dxa"/>
               <w:right w:w="85" w:type="dxa"/>
             </w:tcMar>
+            <w:tcBorders>
+              <w:bottom w:val="single" w:sz="8" w:color="FF0006"/>
+            </w:tcBorders>
           </w:tcPr>
           <w:p>
             <w:pPr>
-              <w:spacing w:after="40" w:before="40" w:line="240" w:lineRule="auto"/>
+              <w:spacing w:after="20" w:before="20" w:line="245" w:lineRule="auto"/>
             </w:pPr>
             <w:r>
               <w:rPr>
                 <w:b/>
                 <w:sz w:val="20"/>
+                <w:color w:val="FFFFFF"/>
               </w:rPr>
               <w:t>Concepto</w:t>
             </w:r>
@@ -109,24 +113,28 @@
         </w:tc>
         <w:tc>
           <w:tcPr>
-            <w:tcW w:type="dxa" w:w="2016"/>
+            <w:tcW w:type="dxa" w:w="1987"/>
             <w:vAlign w:val="center"/>
-            <w:shd w:fill="DCE6ED"/>
+            <w:shd w:fill="242021"/>
             <w:tcMar>
               <w:top w:w="85" w:type="dxa"/>
               <w:left w:w="85" w:type="dxa"/>
               <w:bottom w:w="85" w:type="dxa"/>
               <w:right w:w="85" w:type="dxa"/>
             </w:tcMar>
+            <w:tcBorders>
+              <w:bottom w:val="single" w:sz="8" w:color="FF0006"/>
+            </w:tcBorders>
           </w:tcPr>
           <w:p>
             <w:pPr>
-              <w:spacing w:after="40" w:before="40" w:line="240" w:lineRule="auto"/>
+              <w:spacing w:after="20" w:before="20" w:line="245" w:lineRule="auto"/>
             </w:pPr>
             <w:r>
               <w:rPr>
                 <w:b/>
                 <w:sz w:val="20"/>
+                <w:color w:val="FFFFFF"/>
               </w:rPr>
               <w:t>Base</w:t>
             </w:r>
@@ -134,24 +142,28 @@
         </w:tc>
         <w:tc>
           <w:tcPr>
-            <w:tcW w:type="dxa" w:w="1872"/>
+            <w:tcW w:type="dxa" w:w="1845"/>
             <w:vAlign w:val="center"/>
-            <w:shd w:fill="DCE6ED"/>
+            <w:shd w:fill="242021"/>
             <w:tcMar>
               <w:top w:w="85" w:type="dxa"/>
               <w:left w:w="85" w:type="dxa"/>
               <w:bottom w:w="85" w:type="dxa"/>
               <w:right w:w="85" w:type="dxa"/>
             </w:tcMar>
+            <w:tcBorders>
+              <w:bottom w:val="single" w:sz="8" w:color="FF0006"/>
+            </w:tcBorders>
           </w:tcPr>
           <w:p>
             <w:pPr>
-              <w:spacing w:after="40" w:before="40" w:line="240" w:lineRule="auto"/>
+              <w:spacing w:after="20" w:before="20" w:line="245" w:lineRule="auto"/>
             </w:pPr>
             <w:r>
               <w:rPr>
                 <w:b/>
                 <w:sz w:val="20"/>
+                <w:color w:val="FFFFFF"/>
               </w:rPr>
               <w:t>ISV 15%</w:t>
             </w:r>
@@ -159,24 +171,28 @@
         </w:tc>
         <w:tc>
           <w:tcPr>
-            <w:tcW w:type="dxa" w:w="2160"/>
+            <w:tcW w:type="dxa" w:w="2129"/>
             <w:vAlign w:val="center"/>
-            <w:shd w:fill="DCE6ED"/>
+            <w:shd w:fill="242021"/>
             <w:tcMar>
               <w:top w:w="85" w:type="dxa"/>
               <w:left w:w="85" w:type="dxa"/>
               <w:bottom w:w="85" w:type="dxa"/>
               <w:right w:w="85" w:type="dxa"/>
             </w:tcMar>
+            <w:tcBorders>
+              <w:bottom w:val="single" w:sz="8" w:color="FF0006"/>
+            </w:tcBorders>
           </w:tcPr>
           <w:p>
             <w:pPr>
-              <w:spacing w:after="40" w:before="40" w:line="240" w:lineRule="auto"/>
+              <w:spacing w:after="20" w:before="20" w:line="245" w:lineRule="auto"/>
             </w:pPr>
             <w:r>
               <w:rPr>
                 <w:b/>
                 <w:sz w:val="20"/>
+                <w:color w:val="FFFFFF"/>
               </w:rPr>
               <w:t>Total</w:t>
             </w:r>
@@ -189,7 +205,7 @@
         </w:trPr>
         <w:tc>
           <w:tcPr>
-            <w:tcW w:type="dxa" w:w="4032"/>
+            <w:tcW w:type="dxa" w:w="3974"/>
             <w:vAlign w:val="center"/>
             <w:shd w:fill="FFFFFF"/>
             <w:tcMar>
@@ -201,12 +217,14 @@
           </w:tcPr>
           <w:p>
             <w:pPr>
-              <w:spacing w:after="40" w:before="40" w:line="240" w:lineRule="auto"/>
+              <w:spacing w:after="20" w:before="20" w:line="245" w:lineRule="auto"/>
             </w:pPr>
             <w:r>
               <w:rPr>
                 <w:b w:val="0"/>
                 <w:sz w:val="20"/>
+                <w:color w:val="242021"/>
+                <w:b/>
               </w:rPr>
               <w:t>Desarrollo e implementación</w:t>
             </w:r>
@@ -214,7 +232,7 @@
         </w:tc>
         <w:tc>
           <w:tcPr>
-            <w:tcW w:type="dxa" w:w="2016"/>
+            <w:tcW w:type="dxa" w:w="1987"/>
             <w:vAlign w:val="center"/>
             <w:shd w:fill="FFFFFF"/>
             <w:tcMar>
@@ -226,12 +244,15 @@
           </w:tcPr>
           <w:p>
             <w:pPr>
-              <w:spacing w:after="40" w:before="40" w:line="240" w:lineRule="auto"/>
+              <w:spacing w:after="20" w:before="20" w:line="245" w:lineRule="auto"/>
+              <w:jc w:val="right"/>
             </w:pPr>
             <w:r>
               <w:rPr>
                 <w:b w:val="0"/>
                 <w:sz w:val="20"/>
+                <w:color w:val="242021"/>
+                <w:b/>
               </w:rPr>
               <w:t>L 170,000</w:t>
             </w:r>
@@ -239,7 +260,7 @@
         </w:tc>
         <w:tc>
           <w:tcPr>
-            <w:tcW w:type="dxa" w:w="1872"/>
+            <w:tcW w:type="dxa" w:w="1845"/>
             <w:vAlign w:val="center"/>
             <w:shd w:fill="FFFFFF"/>
             <w:tcMar>
@@ -251,12 +272,15 @@
           </w:tcPr>
           <w:p>
             <w:pPr>
-              <w:spacing w:after="40" w:before="40" w:line="240" w:lineRule="auto"/>
+              <w:spacing w:after="20" w:before="20" w:line="245" w:lineRule="auto"/>
+              <w:jc w:val="right"/>
             </w:pPr>
             <w:r>
               <w:rPr>
                 <w:b w:val="0"/>
                 <w:sz w:val="20"/>
+                <w:color w:val="242021"/>
+                <w:b/>
               </w:rPr>
               <w:t>L 25,500</w:t>
             </w:r>
@@ -264,7 +288,7 @@
         </w:tc>
         <w:tc>
           <w:tcPr>
-            <w:tcW w:type="dxa" w:w="2160"/>
+            <w:tcW w:type="dxa" w:w="2129"/>
             <w:vAlign w:val="center"/>
             <w:shd w:fill="FFFFFF"/>
             <w:tcMar>
@@ -276,12 +300,15 @@
           </w:tcPr>
           <w:p>
             <w:pPr>
-              <w:spacing w:after="40" w:before="40" w:line="240" w:lineRule="auto"/>
+              <w:spacing w:after="20" w:before="20" w:line="245" w:lineRule="auto"/>
+              <w:jc w:val="right"/>
             </w:pPr>
             <w:r>
               <w:rPr>
                 <w:b w:val="0"/>
                 <w:sz w:val="20"/>
+                <w:color w:val="242021"/>
+                <w:b/>
               </w:rPr>
               <w:t>L 195,500</w:t>
             </w:r>
@@ -294,9 +321,9 @@
         </w:trPr>
         <w:tc>
           <w:tcPr>
-            <w:tcW w:type="dxa" w:w="4032"/>
+            <w:tcW w:type="dxa" w:w="3974"/>
             <w:vAlign w:val="center"/>
-            <w:shd w:fill="F5F7F9"/>
+            <w:shd w:fill="F5F5F5"/>
             <w:tcMar>
               <w:top w:w="85" w:type="dxa"/>
               <w:left w:w="85" w:type="dxa"/>
@@ -306,12 +333,13 @@
           </w:tcPr>
           <w:p>
             <w:pPr>
-              <w:spacing w:after="40" w:before="40" w:line="240" w:lineRule="auto"/>
+              <w:spacing w:after="20" w:before="20" w:line="245" w:lineRule="auto"/>
             </w:pPr>
             <w:r>
               <w:rPr>
                 <w:b w:val="0"/>
                 <w:sz w:val="20"/>
+                <w:color w:val="242021"/>
               </w:rPr>
               <w:t>Anticipo del 50%</w:t>
             </w:r>
@@ -319,9 +347,9 @@
         </w:tc>
         <w:tc>
           <w:tcPr>
-            <w:tcW w:type="dxa" w:w="2016"/>
+            <w:tcW w:type="dxa" w:w="1987"/>
             <w:vAlign w:val="center"/>
-            <w:shd w:fill="F5F7F9"/>
+            <w:shd w:fill="F5F5F5"/>
             <w:tcMar>
               <w:top w:w="85" w:type="dxa"/>
               <w:left w:w="85" w:type="dxa"/>
@@ -331,12 +359,14 @@
           </w:tcPr>
           <w:p>
             <w:pPr>
-              <w:spacing w:after="40" w:before="40" w:line="240" w:lineRule="auto"/>
+              <w:spacing w:after="20" w:before="20" w:line="245" w:lineRule="auto"/>
+              <w:jc w:val="right"/>
             </w:pPr>
             <w:r>
               <w:rPr>
                 <w:b w:val="0"/>
                 <w:sz w:val="20"/>
+                <w:color w:val="242021"/>
               </w:rPr>
               <w:t>L 85,000</w:t>
             </w:r>
@@ -344,9 +374,9 @@
         </w:tc>
         <w:tc>
           <w:tcPr>
-            <w:tcW w:type="dxa" w:w="1872"/>
+            <w:tcW w:type="dxa" w:w="1845"/>
             <w:vAlign w:val="center"/>
-            <w:shd w:fill="F5F7F9"/>
+            <w:shd w:fill="F5F5F5"/>
             <w:tcMar>
               <w:top w:w="85" w:type="dxa"/>
               <w:left w:w="85" w:type="dxa"/>
@@ -356,12 +386,14 @@
           </w:tcPr>
           <w:p>
             <w:pPr>
-              <w:spacing w:after="40" w:before="40" w:line="240" w:lineRule="auto"/>
+              <w:spacing w:after="20" w:before="20" w:line="245" w:lineRule="auto"/>
+              <w:jc w:val="right"/>
             </w:pPr>
             <w:r>
               <w:rPr>
                 <w:b w:val="0"/>
                 <w:sz w:val="20"/>
+                <w:color w:val="242021"/>
               </w:rPr>
               <w:t>L 12,750</w:t>
             </w:r>
@@ -369,9 +401,9 @@
         </w:tc>
         <w:tc>
           <w:tcPr>
-            <w:tcW w:type="dxa" w:w="2160"/>
+            <w:tcW w:type="dxa" w:w="2129"/>
             <w:vAlign w:val="center"/>
-            <w:shd w:fill="F5F7F9"/>
+            <w:shd w:fill="F5F5F5"/>
             <w:tcMar>
               <w:top w:w="85" w:type="dxa"/>
               <w:left w:w="85" w:type="dxa"/>
@@ -381,12 +413,14 @@
           </w:tcPr>
           <w:p>
             <w:pPr>
-              <w:spacing w:after="40" w:before="40" w:line="240" w:lineRule="auto"/>
+              <w:spacing w:after="20" w:before="20" w:line="245" w:lineRule="auto"/>
+              <w:jc w:val="right"/>
             </w:pPr>
             <w:r>
               <w:rPr>
                 <w:b w:val="0"/>
                 <w:sz w:val="20"/>
+                <w:color w:val="242021"/>
               </w:rPr>
               <w:t>L 97,750</w:t>
             </w:r>
@@ -399,7 +433,7 @@
         </w:trPr>
         <w:tc>
           <w:tcPr>
-            <w:tcW w:type="dxa" w:w="4032"/>
+            <w:tcW w:type="dxa" w:w="3974"/>
             <w:vAlign w:val="center"/>
             <w:shd w:fill="FFFFFF"/>
             <w:tcMar>
@@ -411,12 +445,13 @@
           </w:tcPr>
           <w:p>
             <w:pPr>
-              <w:spacing w:after="40" w:before="40" w:line="240" w:lineRule="auto"/>
+              <w:spacing w:after="20" w:before="20" w:line="245" w:lineRule="auto"/>
             </w:pPr>
             <w:r>
               <w:rPr>
                 <w:b w:val="0"/>
                 <w:sz w:val="20"/>
+                <w:color w:val="242021"/>
               </w:rPr>
               <w:t>Aceptación final del 50%</w:t>
             </w:r>
@@ -424,7 +459,7 @@
         </w:tc>
         <w:tc>
           <w:tcPr>
-            <w:tcW w:type="dxa" w:w="2016"/>
+            <w:tcW w:type="dxa" w:w="1987"/>
             <w:vAlign w:val="center"/>
             <w:shd w:fill="FFFFFF"/>
             <w:tcMar>
@@ -436,12 +471,14 @@
           </w:tcPr>
           <w:p>
             <w:pPr>
-              <w:spacing w:after="40" w:before="40" w:line="240" w:lineRule="auto"/>
+              <w:spacing w:after="20" w:before="20" w:line="245" w:lineRule="auto"/>
+              <w:jc w:val="right"/>
             </w:pPr>
             <w:r>
               <w:rPr>
                 <w:b w:val="0"/>
                 <w:sz w:val="20"/>
+                <w:color w:val="242021"/>
               </w:rPr>
               <w:t>L 85,000</w:t>
             </w:r>
@@ -449,7 +486,7 @@
         </w:tc>
         <w:tc>
           <w:tcPr>
-            <w:tcW w:type="dxa" w:w="1872"/>
+            <w:tcW w:type="dxa" w:w="1845"/>
             <w:vAlign w:val="center"/>
             <w:shd w:fill="FFFFFF"/>
             <w:tcMar>
@@ -461,12 +498,14 @@
           </w:tcPr>
           <w:p>
             <w:pPr>
-              <w:spacing w:after="40" w:before="40" w:line="240" w:lineRule="auto"/>
+              <w:spacing w:after="20" w:before="20" w:line="245" w:lineRule="auto"/>
+              <w:jc w:val="right"/>
             </w:pPr>
             <w:r>
               <w:rPr>
                 <w:b w:val="0"/>
                 <w:sz w:val="20"/>
+                <w:color w:val="242021"/>
               </w:rPr>
               <w:t>L 12,750</w:t>
             </w:r>
@@ -474,7 +513,7 @@
         </w:tc>
         <w:tc>
           <w:tcPr>
-            <w:tcW w:type="dxa" w:w="2160"/>
+            <w:tcW w:type="dxa" w:w="2129"/>
             <w:vAlign w:val="center"/>
             <w:shd w:fill="FFFFFF"/>
             <w:tcMar>
@@ -486,12 +525,14 @@
           </w:tcPr>
           <w:p>
             <w:pPr>
-              <w:spacing w:after="40" w:before="40" w:line="240" w:lineRule="auto"/>
+              <w:spacing w:after="20" w:before="20" w:line="245" w:lineRule="auto"/>
+              <w:jc w:val="right"/>
             </w:pPr>
             <w:r>
               <w:rPr>
                 <w:b w:val="0"/>
                 <w:sz w:val="20"/>
+                <w:color w:val="242021"/>
               </w:rPr>
               <w:t>L 97,750</w:t>
             </w:r>
@@ -815,8 +856,8 @@
         </w:tblBorders>
       </w:tblPr>
       <w:tblGrid>
-        <w:gridCol w:w="2376"/>
-        <w:gridCol w:w="7704"/>
+        <w:gridCol w:w="2342"/>
+        <w:gridCol w:w="7594"/>
       </w:tblGrid>
       <w:tr>
         <w:trPr>
@@ -825,24 +866,28 @@
         </w:trPr>
         <w:tc>
           <w:tcPr>
-            <w:tcW w:type="dxa" w:w="2376"/>
+            <w:tcW w:type="dxa" w:w="2342"/>
             <w:vAlign w:val="center"/>
-            <w:shd w:fill="DCE6ED"/>
+            <w:shd w:fill="242021"/>
             <w:tcMar>
               <w:top w:w="85" w:type="dxa"/>
               <w:left w:w="85" w:type="dxa"/>
               <w:bottom w:w="85" w:type="dxa"/>
               <w:right w:w="85" w:type="dxa"/>
             </w:tcMar>
+            <w:tcBorders>
+              <w:bottom w:val="single" w:sz="8" w:color="FF0006"/>
+            </w:tcBorders>
           </w:tcPr>
           <w:p>
             <w:pPr>
-              <w:spacing w:after="40" w:before="40" w:line="240" w:lineRule="auto"/>
+              <w:spacing w:after="20" w:before="20" w:line="245" w:lineRule="auto"/>
             </w:pPr>
             <w:r>
               <w:rPr>
                 <w:b/>
                 <w:sz w:val="20"/>
+                <w:color w:val="FFFFFF"/>
               </w:rPr>
               <w:t>Recurso</w:t>
             </w:r>
@@ -850,24 +895,28 @@
         </w:tc>
         <w:tc>
           <w:tcPr>
-            <w:tcW w:type="dxa" w:w="7704"/>
+            <w:tcW w:type="dxa" w:w="7594"/>
             <w:vAlign w:val="center"/>
-            <w:shd w:fill="DCE6ED"/>
+            <w:shd w:fill="242021"/>
             <w:tcMar>
               <w:top w:w="85" w:type="dxa"/>
               <w:left w:w="85" w:type="dxa"/>
               <w:bottom w:w="85" w:type="dxa"/>
               <w:right w:w="85" w:type="dxa"/>
             </w:tcMar>
+            <w:tcBorders>
+              <w:bottom w:val="single" w:sz="8" w:color="FF0006"/>
+            </w:tcBorders>
           </w:tcPr>
           <w:p>
             <w:pPr>
-              <w:spacing w:after="40" w:before="40" w:line="240" w:lineRule="auto"/>
+              <w:spacing w:after="20" w:before="20" w:line="245" w:lineRule="auto"/>
             </w:pPr>
             <w:r>
               <w:rPr>
                 <w:b/>
                 <w:sz w:val="20"/>
+                <w:color w:val="FFFFFF"/>
               </w:rPr>
               <w:t>Requerimiento inicial propuesto</w:t>
             </w:r>
@@ -880,7 +929,7 @@
         </w:trPr>
         <w:tc>
           <w:tcPr>
-            <w:tcW w:type="dxa" w:w="2376"/>
+            <w:tcW w:type="dxa" w:w="2342"/>
             <w:vAlign w:val="center"/>
             <w:shd w:fill="FFFFFF"/>
             <w:tcMar>
@@ -892,12 +941,13 @@
           </w:tcPr>
           <w:p>
             <w:pPr>
-              <w:spacing w:after="40" w:before="40" w:line="240" w:lineRule="auto"/>
+              <w:spacing w:after="20" w:before="20" w:line="245" w:lineRule="auto"/>
             </w:pPr>
             <w:r>
               <w:rPr>
                 <w:b w:val="0"/>
                 <w:sz w:val="20"/>
+                <w:color w:val="242021"/>
               </w:rPr>
               <w:t>Servidor de producción</w:t>
             </w:r>
@@ -905,7 +955,7 @@
         </w:tc>
         <w:tc>
           <w:tcPr>
-            <w:tcW w:type="dxa" w:w="7704"/>
+            <w:tcW w:type="dxa" w:w="7594"/>
             <w:vAlign w:val="center"/>
             <w:shd w:fill="FFFFFF"/>
             <w:tcMar>
@@ -917,12 +967,13 @@
           </w:tcPr>
           <w:p>
             <w:pPr>
-              <w:spacing w:after="40" w:before="40" w:line="240" w:lineRule="auto"/>
+              <w:spacing w:after="20" w:before="20" w:line="245" w:lineRule="auto"/>
             </w:pPr>
             <w:r>
               <w:rPr>
                 <w:b w:val="0"/>
                 <w:sz w:val="20"/>
+                <w:color w:val="242021"/>
               </w:rPr>
               <w:t>VM aislada, preferiblemente Linux compatible; referencia inicial de 8 vCPU, 16 GB RAM y 150 GB SSD para aplicación, temporales y registros.</w:t>
             </w:r>
@@ -935,9 +986,9 @@
         </w:trPr>
         <w:tc>
           <w:tcPr>
-            <w:tcW w:type="dxa" w:w="2376"/>
+            <w:tcW w:type="dxa" w:w="2342"/>
             <w:vAlign w:val="center"/>
-            <w:shd w:fill="F5F7F9"/>
+            <w:shd w:fill="F5F5F5"/>
             <w:tcMar>
               <w:top w:w="85" w:type="dxa"/>
               <w:left w:w="85" w:type="dxa"/>
@@ -947,12 +998,13 @@
           </w:tcPr>
           <w:p>
             <w:pPr>
-              <w:spacing w:after="40" w:before="40" w:line="240" w:lineRule="auto"/>
+              <w:spacing w:after="20" w:before="20" w:line="245" w:lineRule="auto"/>
             </w:pPr>
             <w:r>
               <w:rPr>
                 <w:b w:val="0"/>
                 <w:sz w:val="20"/>
+                <w:color w:val="242021"/>
               </w:rPr>
               <w:t>Pruebas y UAT</w:t>
             </w:r>
@@ -960,9 +1012,9 @@
         </w:tc>
         <w:tc>
           <w:tcPr>
-            <w:tcW w:type="dxa" w:w="7704"/>
+            <w:tcW w:type="dxa" w:w="7594"/>
             <w:vAlign w:val="center"/>
-            <w:shd w:fill="F5F7F9"/>
+            <w:shd w:fill="F5F5F5"/>
             <w:tcMar>
               <w:top w:w="85" w:type="dxa"/>
               <w:left w:w="85" w:type="dxa"/>
@@ -972,12 +1024,13 @@
           </w:tcPr>
           <w:p>
             <w:pPr>
-              <w:spacing w:after="40" w:before="40" w:line="240" w:lineRule="auto"/>
+              <w:spacing w:after="20" w:before="20" w:line="245" w:lineRule="auto"/>
             </w:pPr>
             <w:r>
               <w:rPr>
                 <w:b w:val="0"/>
                 <w:sz w:val="20"/>
+                <w:color w:val="242021"/>
               </w:rPr>
               <w:t>Ambiente separado; referencia de 4 vCPU, 8 GB RAM y 80 GB de disco. Accesos disponibles al iniciar la semana 2.</w:t>
             </w:r>
@@ -990,7 +1043,7 @@
         </w:trPr>
         <w:tc>
           <w:tcPr>
-            <w:tcW w:type="dxa" w:w="2376"/>
+            <w:tcW w:type="dxa" w:w="2342"/>
             <w:vAlign w:val="center"/>
             <w:shd w:fill="FFFFFF"/>
             <w:tcMar>
@@ -1002,12 +1055,13 @@
           </w:tcPr>
           <w:p>
             <w:pPr>
-              <w:spacing w:after="40" w:before="40" w:line="240" w:lineRule="auto"/>
+              <w:spacing w:after="20" w:before="20" w:line="245" w:lineRule="auto"/>
             </w:pPr>
             <w:r>
               <w:rPr>
                 <w:b w:val="0"/>
                 <w:sz w:val="20"/>
+                <w:color w:val="242021"/>
               </w:rPr>
               <w:t>Base de datos</w:t>
             </w:r>
@@ -1015,7 +1069,7 @@
         </w:tc>
         <w:tc>
           <w:tcPr>
-            <w:tcW w:type="dxa" w:w="7704"/>
+            <w:tcW w:type="dxa" w:w="7594"/>
             <w:vAlign w:val="center"/>
             <w:shd w:fill="FFFFFF"/>
             <w:tcMar>
@@ -1027,12 +1081,13 @@
           </w:tcPr>
           <w:p>
             <w:pPr>
-              <w:spacing w:after="40" w:before="40" w:line="240" w:lineRule="auto"/>
+              <w:spacing w:after="20" w:before="20" w:line="245" w:lineRule="auto"/>
             </w:pPr>
             <w:r>
               <w:rPr>
                 <w:b w:val="0"/>
                 <w:sz w:val="20"/>
+                <w:color w:val="242021"/>
               </w:rPr>
               <w:t>Servicio administrado por el banco y esquema o acceso por servicios para configuración, trabajos, resultados y auditoría. Motor, versión y mecanismo se acuerdan en semana 1.</w:t>
             </w:r>
@@ -1045,9 +1100,9 @@
         </w:trPr>
         <w:tc>
           <w:tcPr>
-            <w:tcW w:type="dxa" w:w="2376"/>
+            <w:tcW w:type="dxa" w:w="2342"/>
             <w:vAlign w:val="center"/>
-            <w:shd w:fill="F5F7F9"/>
+            <w:shd w:fill="F5F5F5"/>
             <w:tcMar>
               <w:top w:w="85" w:type="dxa"/>
               <w:left w:w="85" w:type="dxa"/>
@@ -1057,12 +1112,13 @@
           </w:tcPr>
           <w:p>
             <w:pPr>
-              <w:spacing w:after="40" w:before="40" w:line="240" w:lineRule="auto"/>
+              <w:spacing w:after="20" w:before="20" w:line="245" w:lineRule="auto"/>
             </w:pPr>
             <w:r>
               <w:rPr>
                 <w:b w:val="0"/>
                 <w:sz w:val="20"/>
+                <w:color w:val="242021"/>
               </w:rPr>
               <w:t>Documentos</w:t>
             </w:r>
@@ -1070,9 +1126,9 @@
         </w:tc>
         <w:tc>
           <w:tcPr>
-            <w:tcW w:type="dxa" w:w="7704"/>
+            <w:tcW w:type="dxa" w:w="7594"/>
             <w:vAlign w:val="center"/>
-            <w:shd w:fill="F5F7F9"/>
+            <w:shd w:fill="F5F5F5"/>
             <w:tcMar>
               <w:top w:w="85" w:type="dxa"/>
               <w:left w:w="85" w:type="dxa"/>
@@ -1082,12 +1138,13 @@
           </w:tcPr>
           <w:p>
             <w:pPr>
-              <w:spacing w:after="40" w:before="40" w:line="240" w:lineRule="auto"/>
+              <w:spacing w:after="20" w:before="20" w:line="245" w:lineRule="auto"/>
             </w:pPr>
             <w:r>
               <w:rPr>
                 <w:b w:val="0"/>
                 <w:sz w:val="20"/>
+                <w:color w:val="242021"/>
               </w:rPr>
               <w:t>Repositorio privado del banco con acceso autenticado. Capacidad adicional según volumen y retención; limpieza de temporales definida.</w:t>
             </w:r>
@@ -1100,7 +1157,7 @@
         </w:trPr>
         <w:tc>
           <w:tcPr>
-            <w:tcW w:type="dxa" w:w="2376"/>
+            <w:tcW w:type="dxa" w:w="2342"/>
             <w:vAlign w:val="center"/>
             <w:shd w:fill="FFFFFF"/>
             <w:tcMar>
@@ -1112,12 +1169,13 @@
           </w:tcPr>
           <w:p>
             <w:pPr>
-              <w:spacing w:after="40" w:before="40" w:line="240" w:lineRule="auto"/>
+              <w:spacing w:after="20" w:before="20" w:line="245" w:lineRule="auto"/>
             </w:pPr>
             <w:r>
               <w:rPr>
                 <w:b w:val="0"/>
                 <w:sz w:val="20"/>
+                <w:color w:val="242021"/>
               </w:rPr>
               <w:t>Red y acceso</w:t>
             </w:r>
@@ -1125,7 +1183,7 @@
         </w:tc>
         <w:tc>
           <w:tcPr>
-            <w:tcW w:type="dxa" w:w="7704"/>
+            <w:tcW w:type="dxa" w:w="7594"/>
             <w:vAlign w:val="center"/>
             <w:shd w:fill="FFFFFF"/>
             <w:tcMar>
@@ -1137,12 +1195,13 @@
           </w:tcPr>
           <w:p>
             <w:pPr>
-              <w:spacing w:after="40" w:before="40" w:line="240" w:lineRule="auto"/>
+              <w:spacing w:after="20" w:before="20" w:line="245" w:lineRule="auto"/>
             </w:pPr>
             <w:r>
               <w:rPr>
                 <w:b w:val="0"/>
                 <w:sz w:val="20"/>
+                <w:color w:val="242021"/>
               </w:rPr>
               <w:t>HTTPS entre APEX y el motor, DNS y certificado del portal, salida HTTPS hacia Gemini y acceso técnico por VPN o mecanismo autorizado.</w:t>
             </w:r>
@@ -1155,9 +1214,9 @@
         </w:trPr>
         <w:tc>
           <w:tcPr>
-            <w:tcW w:type="dxa" w:w="2376"/>
+            <w:tcW w:type="dxa" w:w="2342"/>
             <w:vAlign w:val="center"/>
-            <w:shd w:fill="F5F7F9"/>
+            <w:shd w:fill="F5F5F5"/>
             <w:tcMar>
               <w:top w:w="85" w:type="dxa"/>
               <w:left w:w="85" w:type="dxa"/>
@@ -1167,12 +1226,13 @@
           </w:tcPr>
           <w:p>
             <w:pPr>
-              <w:spacing w:after="40" w:before="40" w:line="240" w:lineRule="auto"/>
+              <w:spacing w:after="20" w:before="20" w:line="245" w:lineRule="auto"/>
             </w:pPr>
             <w:r>
               <w:rPr>
                 <w:b w:val="0"/>
                 <w:sz w:val="20"/>
+                <w:color w:val="242021"/>
               </w:rPr>
               <w:t>Operación</w:t>
             </w:r>
@@ -1180,9 +1240,9 @@
         </w:tc>
         <w:tc>
           <w:tcPr>
-            <w:tcW w:type="dxa" w:w="7704"/>
+            <w:tcW w:type="dxa" w:w="7594"/>
             <w:vAlign w:val="center"/>
-            <w:shd w:fill="F5F7F9"/>
+            <w:shd w:fill="F5F5F5"/>
             <w:tcMar>
               <w:top w:w="85" w:type="dxa"/>
               <w:left w:w="85" w:type="dxa"/>
@@ -1192,12 +1252,13 @@
           </w:tcPr>
           <w:p>
             <w:pPr>
-              <w:spacing w:after="40" w:before="40" w:line="240" w:lineRule="auto"/>
+              <w:spacing w:after="20" w:before="20" w:line="245" w:lineRule="auto"/>
             </w:pPr>
             <w:r>
               <w:rPr>
                 <w:b w:val="0"/>
                 <w:sz w:val="20"/>
+                <w:color w:val="242021"/>
               </w:rPr>
               <w:t>Cuentas de servicio con permisos mínimos, gestión de secretos, monitoreo, respaldos y restauración. Políticas de retención y recuperación documentadas.</w:t>
             </w:r>
@@ -1282,10 +1343,10 @@
         </w:tblBorders>
       </w:tblPr>
       <w:tblGrid>
-        <w:gridCol w:w="2232"/>
-        <w:gridCol w:w="2376"/>
-        <w:gridCol w:w="2448"/>
-        <w:gridCol w:w="3024"/>
+        <w:gridCol w:w="2200"/>
+        <w:gridCol w:w="2342"/>
+        <w:gridCol w:w="2413"/>
+        <w:gridCol w:w="2981"/>
       </w:tblGrid>
       <w:tr>
         <w:trPr>
@@ -1294,24 +1355,28 @@
         </w:trPr>
         <w:tc>
           <w:tcPr>
-            <w:tcW w:type="dxa" w:w="2232"/>
+            <w:tcW w:type="dxa" w:w="2200"/>
             <w:vAlign w:val="center"/>
-            <w:shd w:fill="DCE6ED"/>
+            <w:shd w:fill="242021"/>
             <w:tcMar>
               <w:top w:w="85" w:type="dxa"/>
               <w:left w:w="85" w:type="dxa"/>
               <w:bottom w:w="85" w:type="dxa"/>
               <w:right w:w="85" w:type="dxa"/>
             </w:tcMar>
+            <w:tcBorders>
+              <w:bottom w:val="single" w:sz="8" w:color="FF0006"/>
+            </w:tcBorders>
           </w:tcPr>
           <w:p>
             <w:pPr>
-              <w:spacing w:after="40" w:before="40" w:line="240" w:lineRule="auto"/>
+              <w:spacing w:after="20" w:before="20" w:line="245" w:lineRule="auto"/>
             </w:pPr>
             <w:r>
               <w:rPr>
                 <w:b/>
                 <w:sz w:val="20"/>
+                <w:color w:val="FFFFFF"/>
               </w:rPr>
               <w:t>Actividad</w:t>
             </w:r>
@@ -1319,24 +1384,28 @@
         </w:tc>
         <w:tc>
           <w:tcPr>
-            <w:tcW w:type="dxa" w:w="2376"/>
+            <w:tcW w:type="dxa" w:w="2342"/>
             <w:vAlign w:val="center"/>
-            <w:shd w:fill="DCE6ED"/>
+            <w:shd w:fill="242021"/>
             <w:tcMar>
               <w:top w:w="85" w:type="dxa"/>
               <w:left w:w="85" w:type="dxa"/>
               <w:bottom w:w="85" w:type="dxa"/>
               <w:right w:w="85" w:type="dxa"/>
             </w:tcMar>
+            <w:tcBorders>
+              <w:bottom w:val="single" w:sz="8" w:color="FF0006"/>
+            </w:tcBorders>
           </w:tcPr>
           <w:p>
             <w:pPr>
-              <w:spacing w:after="40" w:before="40" w:line="240" w:lineRule="auto"/>
+              <w:spacing w:after="20" w:before="20" w:line="245" w:lineRule="auto"/>
             </w:pPr>
             <w:r>
               <w:rPr>
                 <w:b/>
                 <w:sz w:val="20"/>
+                <w:color w:val="FFFFFF"/>
               </w:rPr>
               <w:t>MACAO</w:t>
             </w:r>
@@ -1344,24 +1413,28 @@
         </w:tc>
         <w:tc>
           <w:tcPr>
-            <w:tcW w:type="dxa" w:w="2448"/>
+            <w:tcW w:type="dxa" w:w="2413"/>
             <w:vAlign w:val="center"/>
-            <w:shd w:fill="DCE6ED"/>
+            <w:shd w:fill="242021"/>
             <w:tcMar>
               <w:top w:w="85" w:type="dxa"/>
               <w:left w:w="85" w:type="dxa"/>
               <w:bottom w:w="85" w:type="dxa"/>
               <w:right w:w="85" w:type="dxa"/>
             </w:tcMar>
+            <w:tcBorders>
+              <w:bottom w:val="single" w:sz="8" w:color="FF0006"/>
+            </w:tcBorders>
           </w:tcPr>
           <w:p>
             <w:pPr>
-              <w:spacing w:after="40" w:before="40" w:line="240" w:lineRule="auto"/>
+              <w:spacing w:after="20" w:before="20" w:line="245" w:lineRule="auto"/>
             </w:pPr>
             <w:r>
               <w:rPr>
                 <w:b/>
                 <w:sz w:val="20"/>
+                <w:color w:val="FFFFFF"/>
               </w:rPr>
               <w:t>IT del banco</w:t>
             </w:r>
@@ -1369,24 +1442,28 @@
         </w:tc>
         <w:tc>
           <w:tcPr>
-            <w:tcW w:type="dxa" w:w="3024"/>
+            <w:tcW w:type="dxa" w:w="2981"/>
             <w:vAlign w:val="center"/>
-            <w:shd w:fill="DCE6ED"/>
+            <w:shd w:fill="242021"/>
             <w:tcMar>
               <w:top w:w="85" w:type="dxa"/>
               <w:left w:w="85" w:type="dxa"/>
               <w:bottom w:w="85" w:type="dxa"/>
               <w:right w:w="85" w:type="dxa"/>
             </w:tcMar>
+            <w:tcBorders>
+              <w:bottom w:val="single" w:sz="8" w:color="FF0006"/>
+            </w:tcBorders>
           </w:tcPr>
           <w:p>
             <w:pPr>
-              <w:spacing w:after="40" w:before="40" w:line="240" w:lineRule="auto"/>
+              <w:spacing w:after="20" w:before="20" w:line="245" w:lineRule="auto"/>
             </w:pPr>
             <w:r>
               <w:rPr>
                 <w:b/>
                 <w:sz w:val="20"/>
+                <w:color w:val="FFFFFF"/>
               </w:rPr>
               <w:t>AFP y responsables de negocio</w:t>
             </w:r>
@@ -1399,7 +1476,7 @@
         </w:trPr>
         <w:tc>
           <w:tcPr>
-            <w:tcW w:type="dxa" w:w="2232"/>
+            <w:tcW w:type="dxa" w:w="2200"/>
             <w:vAlign w:val="center"/>
             <w:shd w:fill="FFFFFF"/>
             <w:tcMar>
@@ -1411,12 +1488,13 @@
           </w:tcPr>
           <w:p>
             <w:pPr>
-              <w:spacing w:after="40" w:before="40" w:line="240" w:lineRule="auto"/>
+              <w:spacing w:after="20" w:before="20" w:line="245" w:lineRule="auto"/>
             </w:pPr>
             <w:r>
               <w:rPr>
                 <w:b w:val="0"/>
                 <w:sz w:val="20"/>
+                <w:color w:val="242021"/>
               </w:rPr>
               <w:t>Formularios y bandeja APEX</w:t>
             </w:r>
@@ -1424,7 +1502,7 @@
         </w:tc>
         <w:tc>
           <w:tcPr>
-            <w:tcW w:type="dxa" w:w="2376"/>
+            <w:tcW w:type="dxa" w:w="2342"/>
             <w:vAlign w:val="center"/>
             <w:shd w:fill="FFFFFF"/>
             <w:tcMar>
@@ -1436,12 +1514,13 @@
           </w:tcPr>
           <w:p>
             <w:pPr>
-              <w:spacing w:after="40" w:before="40" w:line="240" w:lineRule="auto"/>
+              <w:spacing w:after="20" w:before="20" w:line="245" w:lineRule="auto"/>
             </w:pPr>
             <w:r>
               <w:rPr>
                 <w:b w:val="0"/>
                 <w:sz w:val="20"/>
+                <w:color w:val="242021"/>
               </w:rPr>
               <w:t>Apoya contrato de datos</w:t>
             </w:r>
@@ -1449,7 +1528,7 @@
         </w:tc>
         <w:tc>
           <w:tcPr>
-            <w:tcW w:type="dxa" w:w="2448"/>
+            <w:tcW w:type="dxa" w:w="2413"/>
             <w:vAlign w:val="center"/>
             <w:shd w:fill="FFFFFF"/>
             <w:tcMar>
@@ -1461,12 +1540,13 @@
           </w:tcPr>
           <w:p>
             <w:pPr>
-              <w:spacing w:after="40" w:before="40" w:line="240" w:lineRule="auto"/>
+              <w:spacing w:after="20" w:before="20" w:line="245" w:lineRule="auto"/>
             </w:pPr>
             <w:r>
               <w:rPr>
                 <w:b w:val="0"/>
                 <w:sz w:val="20"/>
+                <w:color w:val="242021"/>
               </w:rPr>
               <w:t>Desarrolla y mantiene</w:t>
             </w:r>
@@ -1474,7 +1554,7 @@
         </w:tc>
         <w:tc>
           <w:tcPr>
-            <w:tcW w:type="dxa" w:w="3024"/>
+            <w:tcW w:type="dxa" w:w="2981"/>
             <w:vAlign w:val="center"/>
             <w:shd w:fill="FFFFFF"/>
             <w:tcMar>
@@ -1486,12 +1566,13 @@
           </w:tcPr>
           <w:p>
             <w:pPr>
-              <w:spacing w:after="40" w:before="40" w:line="240" w:lineRule="auto"/>
+              <w:spacing w:after="20" w:before="20" w:line="245" w:lineRule="auto"/>
             </w:pPr>
             <w:r>
               <w:rPr>
                 <w:b w:val="0"/>
                 <w:sz w:val="20"/>
+                <w:color w:val="242021"/>
               </w:rPr>
               <w:t>Define y valida operación</w:t>
             </w:r>
@@ -1504,9 +1585,9 @@
         </w:trPr>
         <w:tc>
           <w:tcPr>
-            <w:tcW w:type="dxa" w:w="2232"/>
+            <w:tcW w:type="dxa" w:w="2200"/>
             <w:vAlign w:val="center"/>
-            <w:shd w:fill="F5F7F9"/>
+            <w:shd w:fill="F5F5F5"/>
             <w:tcMar>
               <w:top w:w="85" w:type="dxa"/>
               <w:left w:w="85" w:type="dxa"/>
@@ -1516,12 +1597,13 @@
           </w:tcPr>
           <w:p>
             <w:pPr>
-              <w:spacing w:after="40" w:before="40" w:line="240" w:lineRule="auto"/>
+              <w:spacing w:after="20" w:before="20" w:line="245" w:lineRule="auto"/>
             </w:pPr>
             <w:r>
               <w:rPr>
                 <w:b w:val="0"/>
                 <w:sz w:val="20"/>
+                <w:color w:val="242021"/>
               </w:rPr>
               <w:t>Integración al sistema central</w:t>
             </w:r>
@@ -1529,9 +1611,9 @@
         </w:tc>
         <w:tc>
           <w:tcPr>
-            <w:tcW w:type="dxa" w:w="2376"/>
+            <w:tcW w:type="dxa" w:w="2342"/>
             <w:vAlign w:val="center"/>
-            <w:shd w:fill="F5F7F9"/>
+            <w:shd w:fill="F5F5F5"/>
             <w:tcMar>
               <w:top w:w="85" w:type="dxa"/>
               <w:left w:w="85" w:type="dxa"/>
@@ -1541,12 +1623,13 @@
           </w:tcPr>
           <w:p>
             <w:pPr>
-              <w:spacing w:after="40" w:before="40" w:line="240" w:lineRule="auto"/>
+              <w:spacing w:after="20" w:before="20" w:line="245" w:lineRule="auto"/>
             </w:pPr>
             <w:r>
               <w:rPr>
                 <w:b w:val="0"/>
                 <w:sz w:val="20"/>
+                <w:color w:val="242021"/>
               </w:rPr>
               <w:t>Entrega resultados a APEX</w:t>
             </w:r>
@@ -1554,9 +1637,9 @@
         </w:tc>
         <w:tc>
           <w:tcPr>
-            <w:tcW w:type="dxa" w:w="2448"/>
+            <w:tcW w:type="dxa" w:w="2413"/>
             <w:vAlign w:val="center"/>
-            <w:shd w:fill="F5F7F9"/>
+            <w:shd w:fill="F5F5F5"/>
             <w:tcMar>
               <w:top w:w="85" w:type="dxa"/>
               <w:left w:w="85" w:type="dxa"/>
@@ -1566,12 +1649,13 @@
           </w:tcPr>
           <w:p>
             <w:pPr>
-              <w:spacing w:after="40" w:before="40" w:line="240" w:lineRule="auto"/>
+              <w:spacing w:after="20" w:before="20" w:line="245" w:lineRule="auto"/>
             </w:pPr>
             <w:r>
               <w:rPr>
                 <w:b w:val="0"/>
                 <w:sz w:val="20"/>
+                <w:color w:val="242021"/>
               </w:rPr>
               <w:t>Desarrolla y opera</w:t>
             </w:r>
@@ -1579,9 +1663,9 @@
         </w:tc>
         <w:tc>
           <w:tcPr>
-            <w:tcW w:type="dxa" w:w="3024"/>
+            <w:tcW w:type="dxa" w:w="2981"/>
             <w:vAlign w:val="center"/>
-            <w:shd w:fill="F5F7F9"/>
+            <w:shd w:fill="F5F5F5"/>
             <w:tcMar>
               <w:top w:w="85" w:type="dxa"/>
               <w:left w:w="85" w:type="dxa"/>
@@ -1591,12 +1675,13 @@
           </w:tcPr>
           <w:p>
             <w:pPr>
-              <w:spacing w:after="40" w:before="40" w:line="240" w:lineRule="auto"/>
+              <w:spacing w:after="20" w:before="20" w:line="245" w:lineRule="auto"/>
             </w:pPr>
             <w:r>
               <w:rPr>
                 <w:b w:val="0"/>
                 <w:sz w:val="20"/>
+                <w:color w:val="242021"/>
               </w:rPr>
               <w:t>Valida registro final</w:t>
             </w:r>
@@ -1609,7 +1694,7 @@
         </w:trPr>
         <w:tc>
           <w:tcPr>
-            <w:tcW w:type="dxa" w:w="2232"/>
+            <w:tcW w:type="dxa" w:w="2200"/>
             <w:vAlign w:val="center"/>
             <w:shd w:fill="FFFFFF"/>
             <w:tcMar>
@@ -1621,12 +1706,13 @@
           </w:tcPr>
           <w:p>
             <w:pPr>
-              <w:spacing w:after="40" w:before="40" w:line="240" w:lineRule="auto"/>
+              <w:spacing w:after="20" w:before="20" w:line="245" w:lineRule="auto"/>
             </w:pPr>
             <w:r>
               <w:rPr>
                 <w:b w:val="0"/>
                 <w:sz w:val="20"/>
+                <w:color w:val="242021"/>
               </w:rPr>
               <w:t>Motor de análisis</w:t>
             </w:r>
@@ -1634,7 +1720,7 @@
         </w:tc>
         <w:tc>
           <w:tcPr>
-            <w:tcW w:type="dxa" w:w="2376"/>
+            <w:tcW w:type="dxa" w:w="2342"/>
             <w:vAlign w:val="center"/>
             <w:shd w:fill="FFFFFF"/>
             <w:tcMar>
@@ -1646,12 +1732,13 @@
           </w:tcPr>
           <w:p>
             <w:pPr>
-              <w:spacing w:after="40" w:before="40" w:line="240" w:lineRule="auto"/>
+              <w:spacing w:after="20" w:before="20" w:line="245" w:lineRule="auto"/>
             </w:pPr>
             <w:r>
               <w:rPr>
                 <w:b w:val="0"/>
                 <w:sz w:val="20"/>
+                <w:color w:val="242021"/>
               </w:rPr>
               <w:t>Desarrolla y prueba</w:t>
             </w:r>
@@ -1659,7 +1746,7 @@
         </w:tc>
         <w:tc>
           <w:tcPr>
-            <w:tcW w:type="dxa" w:w="2448"/>
+            <w:tcW w:type="dxa" w:w="2413"/>
             <w:vAlign w:val="center"/>
             <w:shd w:fill="FFFFFF"/>
             <w:tcMar>
@@ -1671,12 +1758,13 @@
           </w:tcPr>
           <w:p>
             <w:pPr>
-              <w:spacing w:after="40" w:before="40" w:line="240" w:lineRule="auto"/>
+              <w:spacing w:after="20" w:before="20" w:line="245" w:lineRule="auto"/>
             </w:pPr>
             <w:r>
               <w:rPr>
                 <w:b w:val="0"/>
                 <w:sz w:val="20"/>
+                <w:color w:val="242021"/>
               </w:rPr>
               <w:t>Facilita ambiente</w:t>
             </w:r>
@@ -1684,7 +1772,7 @@
         </w:tc>
         <w:tc>
           <w:tcPr>
-            <w:tcW w:type="dxa" w:w="3024"/>
+            <w:tcW w:type="dxa" w:w="2981"/>
             <w:vAlign w:val="center"/>
             <w:shd w:fill="FFFFFF"/>
             <w:tcMar>
@@ -1696,12 +1784,13 @@
           </w:tcPr>
           <w:p>
             <w:pPr>
-              <w:spacing w:after="40" w:before="40" w:line="240" w:lineRule="auto"/>
+              <w:spacing w:after="20" w:before="20" w:line="245" w:lineRule="auto"/>
             </w:pPr>
             <w:r>
               <w:rPr>
                 <w:b w:val="0"/>
                 <w:sz w:val="20"/>
+                <w:color w:val="242021"/>
               </w:rPr>
               <w:t>Valida resultados esperados</w:t>
             </w:r>
@@ -1714,9 +1803,9 @@
         </w:trPr>
         <w:tc>
           <w:tcPr>
-            <w:tcW w:type="dxa" w:w="2232"/>
+            <w:tcW w:type="dxa" w:w="2200"/>
             <w:vAlign w:val="center"/>
-            <w:shd w:fill="F5F7F9"/>
+            <w:shd w:fill="F5F5F5"/>
             <w:tcMar>
               <w:top w:w="85" w:type="dxa"/>
               <w:left w:w="85" w:type="dxa"/>
@@ -1726,12 +1815,13 @@
           </w:tcPr>
           <w:p>
             <w:pPr>
-              <w:spacing w:after="40" w:before="40" w:line="240" w:lineRule="auto"/>
+              <w:spacing w:after="20" w:before="20" w:line="245" w:lineRule="auto"/>
             </w:pPr>
             <w:r>
               <w:rPr>
                 <w:b w:val="0"/>
                 <w:sz w:val="20"/>
+                <w:color w:val="242021"/>
               </w:rPr>
               <w:t>Portal administrativo</w:t>
             </w:r>
@@ -1739,9 +1829,9 @@
         </w:tc>
         <w:tc>
           <w:tcPr>
-            <w:tcW w:type="dxa" w:w="2376"/>
+            <w:tcW w:type="dxa" w:w="2342"/>
             <w:vAlign w:val="center"/>
-            <w:shd w:fill="F5F7F9"/>
+            <w:shd w:fill="F5F5F5"/>
             <w:tcMar>
               <w:top w:w="85" w:type="dxa"/>
               <w:left w:w="85" w:type="dxa"/>
@@ -1751,12 +1841,13 @@
           </w:tcPr>
           <w:p>
             <w:pPr>
-              <w:spacing w:after="40" w:before="40" w:line="240" w:lineRule="auto"/>
+              <w:spacing w:after="20" w:before="20" w:line="245" w:lineRule="auto"/>
             </w:pPr>
             <w:r>
               <w:rPr>
                 <w:b w:val="0"/>
                 <w:sz w:val="20"/>
+                <w:color w:val="242021"/>
               </w:rPr>
               <w:t>Diseña y desarrolla pantallas y servicios</w:t>
             </w:r>
@@ -1764,9 +1855,9 @@
         </w:tc>
         <w:tc>
           <w:tcPr>
-            <w:tcW w:type="dxa" w:w="2448"/>
+            <w:tcW w:type="dxa" w:w="2413"/>
             <w:vAlign w:val="center"/>
-            <w:shd w:fill="F5F7F9"/>
+            <w:shd w:fill="F5F5F5"/>
             <w:tcMar>
               <w:top w:w="85" w:type="dxa"/>
               <w:left w:w="85" w:type="dxa"/>
@@ -1776,12 +1867,13 @@
           </w:tcPr>
           <w:p>
             <w:pPr>
-              <w:spacing w:after="40" w:before="40" w:line="240" w:lineRule="auto"/>
+              <w:spacing w:after="20" w:before="20" w:line="245" w:lineRule="auto"/>
             </w:pPr>
             <w:r>
               <w:rPr>
                 <w:b w:val="0"/>
                 <w:sz w:val="20"/>
+                <w:color w:val="242021"/>
               </w:rPr>
               <w:t>Facilita accesos y red</w:t>
             </w:r>
@@ -1789,9 +1881,9 @@
         </w:tc>
         <w:tc>
           <w:tcPr>
-            <w:tcW w:type="dxa" w:w="3024"/>
+            <w:tcW w:type="dxa" w:w="2981"/>
             <w:vAlign w:val="center"/>
-            <w:shd w:fill="F5F7F9"/>
+            <w:shd w:fill="F5F5F5"/>
             <w:tcMar>
               <w:top w:w="85" w:type="dxa"/>
               <w:left w:w="85" w:type="dxa"/>
@@ -1801,12 +1893,13 @@
           </w:tcPr>
           <w:p>
             <w:pPr>
-              <w:spacing w:after="40" w:before="40" w:line="240" w:lineRule="auto"/>
+              <w:spacing w:after="20" w:before="20" w:line="245" w:lineRule="auto"/>
             </w:pPr>
             <w:r>
               <w:rPr>
                 <w:b w:val="0"/>
                 <w:sz w:val="20"/>
+                <w:color w:val="242021"/>
               </w:rPr>
               <w:t>Designa administradores y valida uso</w:t>
             </w:r>
@@ -1819,7 +1912,7 @@
         </w:trPr>
         <w:tc>
           <w:tcPr>
-            <w:tcW w:type="dxa" w:w="2232"/>
+            <w:tcW w:type="dxa" w:w="2200"/>
             <w:vAlign w:val="center"/>
             <w:shd w:fill="FFFFFF"/>
             <w:tcMar>
@@ -1831,12 +1924,13 @@
           </w:tcPr>
           <w:p>
             <w:pPr>
-              <w:spacing w:after="40" w:before="40" w:line="240" w:lineRule="auto"/>
+              <w:spacing w:after="20" w:before="20" w:line="245" w:lineRule="auto"/>
             </w:pPr>
             <w:r>
               <w:rPr>
                 <w:b w:val="0"/>
                 <w:sz w:val="20"/>
+                <w:color w:val="242021"/>
               </w:rPr>
               <w:t>Reglas y matriz documental</w:t>
             </w:r>
@@ -1844,7 +1938,7 @@
         </w:tc>
         <w:tc>
           <w:tcPr>
-            <w:tcW w:type="dxa" w:w="2376"/>
+            <w:tcW w:type="dxa" w:w="2342"/>
             <w:vAlign w:val="center"/>
             <w:shd w:fill="FFFFFF"/>
             <w:tcMar>
@@ -1856,12 +1950,13 @@
           </w:tcPr>
           <w:p>
             <w:pPr>
-              <w:spacing w:after="40" w:before="40" w:line="240" w:lineRule="auto"/>
+              <w:spacing w:after="20" w:before="20" w:line="245" w:lineRule="auto"/>
             </w:pPr>
             <w:r>
               <w:rPr>
                 <w:b w:val="0"/>
                 <w:sz w:val="20"/>
+                <w:color w:val="242021"/>
               </w:rPr>
               <w:t>Implementa capacidad y configuración inicial</w:t>
             </w:r>
@@ -1869,7 +1964,7 @@
         </w:tc>
         <w:tc>
           <w:tcPr>
-            <w:tcW w:type="dxa" w:w="2448"/>
+            <w:tcW w:type="dxa" w:w="2413"/>
             <w:vAlign w:val="center"/>
             <w:shd w:fill="FFFFFF"/>
             <w:tcMar>
@@ -1881,12 +1976,13 @@
           </w:tcPr>
           <w:p>
             <w:pPr>
-              <w:spacing w:after="40" w:before="40" w:line="240" w:lineRule="auto"/>
+              <w:spacing w:after="20" w:before="20" w:line="245" w:lineRule="auto"/>
             </w:pPr>
             <w:r>
               <w:rPr>
                 <w:b w:val="0"/>
                 <w:sz w:val="20"/>
+                <w:color w:val="242021"/>
               </w:rPr>
               <w:t>Apoya integración</w:t>
             </w:r>
@@ -1894,7 +1990,7 @@
         </w:tc>
         <w:tc>
           <w:tcPr>
-            <w:tcW w:type="dxa" w:w="3024"/>
+            <w:tcW w:type="dxa" w:w="2981"/>
             <w:vAlign w:val="center"/>
             <w:shd w:fill="FFFFFF"/>
             <w:tcMar>
@@ -1906,12 +2002,13 @@
           </w:tcPr>
           <w:p>
             <w:pPr>
-              <w:spacing w:after="40" w:before="40" w:line="240" w:lineRule="auto"/>
+              <w:spacing w:after="20" w:before="20" w:line="245" w:lineRule="auto"/>
             </w:pPr>
             <w:r>
               <w:rPr>
                 <w:b w:val="0"/>
                 <w:sz w:val="20"/>
+                <w:color w:val="242021"/>
               </w:rPr>
               <w:t>Operaciones y Cumplimiento definen y aprueban</w:t>
             </w:r>
@@ -1924,9 +2021,9 @@
         </w:trPr>
         <w:tc>
           <w:tcPr>
-            <w:tcW w:type="dxa" w:w="2232"/>
+            <w:tcW w:type="dxa" w:w="2200"/>
             <w:vAlign w:val="center"/>
-            <w:shd w:fill="F5F7F9"/>
+            <w:shd w:fill="F5F5F5"/>
             <w:tcMar>
               <w:top w:w="85" w:type="dxa"/>
               <w:left w:w="85" w:type="dxa"/>
@@ -1936,12 +2033,13 @@
           </w:tcPr>
           <w:p>
             <w:pPr>
-              <w:spacing w:after="40" w:before="40" w:line="240" w:lineRule="auto"/>
+              <w:spacing w:after="20" w:before="20" w:line="245" w:lineRule="auto"/>
             </w:pPr>
             <w:r>
               <w:rPr>
                 <w:b w:val="0"/>
                 <w:sz w:val="20"/>
+                <w:color w:val="242021"/>
               </w:rPr>
               <w:t>Cambios de reglas en operación</w:t>
             </w:r>
@@ -1949,9 +2047,9 @@
         </w:tc>
         <w:tc>
           <w:tcPr>
-            <w:tcW w:type="dxa" w:w="2376"/>
+            <w:tcW w:type="dxa" w:w="2342"/>
             <w:vAlign w:val="center"/>
-            <w:shd w:fill="F5F7F9"/>
+            <w:shd w:fill="F5F5F5"/>
             <w:tcMar>
               <w:top w:w="85" w:type="dxa"/>
               <w:left w:w="85" w:type="dxa"/>
@@ -1961,12 +2059,13 @@
           </w:tcPr>
           <w:p>
             <w:pPr>
-              <w:spacing w:after="40" w:before="40" w:line="240" w:lineRule="auto"/>
+              <w:spacing w:after="20" w:before="20" w:line="245" w:lineRule="auto"/>
             </w:pPr>
             <w:r>
               <w:rPr>
                 <w:b w:val="0"/>
                 <w:sz w:val="20"/>
+                <w:color w:val="242021"/>
               </w:rPr>
               <w:t>Entrega herramientas y capacitación</w:t>
             </w:r>
@@ -1974,9 +2073,9 @@
         </w:tc>
         <w:tc>
           <w:tcPr>
-            <w:tcW w:type="dxa" w:w="2448"/>
+            <w:tcW w:type="dxa" w:w="2413"/>
             <w:vAlign w:val="center"/>
-            <w:shd w:fill="F5F7F9"/>
+            <w:shd w:fill="F5F5F5"/>
             <w:tcMar>
               <w:top w:w="85" w:type="dxa"/>
               <w:left w:w="85" w:type="dxa"/>
@@ -1986,12 +2085,13 @@
           </w:tcPr>
           <w:p>
             <w:pPr>
-              <w:spacing w:after="40" w:before="40" w:line="240" w:lineRule="auto"/>
+              <w:spacing w:after="20" w:before="20" w:line="245" w:lineRule="auto"/>
             </w:pPr>
             <w:r>
               <w:rPr>
                 <w:b w:val="0"/>
                 <w:sz w:val="20"/>
+                <w:color w:val="242021"/>
               </w:rPr>
               <w:t>Apoya soporte técnico</w:t>
             </w:r>
@@ -1999,9 +2099,9 @@
         </w:tc>
         <w:tc>
           <w:tcPr>
-            <w:tcW w:type="dxa" w:w="3024"/>
+            <w:tcW w:type="dxa" w:w="2981"/>
             <w:vAlign w:val="center"/>
-            <w:shd w:fill="F5F7F9"/>
+            <w:shd w:fill="F5F5F5"/>
             <w:tcMar>
               <w:top w:w="85" w:type="dxa"/>
               <w:left w:w="85" w:type="dxa"/>
@@ -2011,12 +2111,13 @@
           </w:tcPr>
           <w:p>
             <w:pPr>
-              <w:spacing w:after="40" w:before="40" w:line="240" w:lineRule="auto"/>
+              <w:spacing w:after="20" w:before="20" w:line="245" w:lineRule="auto"/>
             </w:pPr>
             <w:r>
               <w:rPr>
                 <w:b w:val="0"/>
                 <w:sz w:val="20"/>
+                <w:color w:val="242021"/>
               </w:rPr>
               <w:t>Administra y autoriza publicación</w:t>
             </w:r>
@@ -2029,7 +2130,7 @@
         </w:trPr>
         <w:tc>
           <w:tcPr>
-            <w:tcW w:type="dxa" w:w="2232"/>
+            <w:tcW w:type="dxa" w:w="2200"/>
             <w:vAlign w:val="center"/>
             <w:shd w:fill="FFFFFF"/>
             <w:tcMar>
@@ -2041,12 +2142,13 @@
           </w:tcPr>
           <w:p>
             <w:pPr>
-              <w:spacing w:after="40" w:before="40" w:line="240" w:lineRule="auto"/>
+              <w:spacing w:after="20" w:before="20" w:line="245" w:lineRule="auto"/>
             </w:pPr>
             <w:r>
               <w:rPr>
                 <w:b w:val="0"/>
                 <w:sz w:val="20"/>
+                <w:color w:val="242021"/>
               </w:rPr>
               <w:t>API e intercambio documental</w:t>
             </w:r>
@@ -2054,7 +2156,7 @@
         </w:tc>
         <w:tc>
           <w:tcPr>
-            <w:tcW w:type="dxa" w:w="2376"/>
+            <w:tcW w:type="dxa" w:w="2342"/>
             <w:vAlign w:val="center"/>
             <w:shd w:fill="FFFFFF"/>
             <w:tcMar>
@@ -2066,12 +2168,13 @@
           </w:tcPr>
           <w:p>
             <w:pPr>
-              <w:spacing w:after="40" w:before="40" w:line="240" w:lineRule="auto"/>
+              <w:spacing w:after="20" w:before="20" w:line="245" w:lineRule="auto"/>
             </w:pPr>
             <w:r>
               <w:rPr>
                 <w:b w:val="0"/>
                 <w:sz w:val="20"/>
+                <w:color w:val="242021"/>
               </w:rPr>
               <w:t>Implementa extremo del motor</w:t>
             </w:r>
@@ -2079,7 +2182,7 @@
         </w:tc>
         <w:tc>
           <w:tcPr>
-            <w:tcW w:type="dxa" w:w="2448"/>
+            <w:tcW w:type="dxa" w:w="2413"/>
             <w:vAlign w:val="center"/>
             <w:shd w:fill="FFFFFF"/>
             <w:tcMar>
@@ -2091,12 +2194,13 @@
           </w:tcPr>
           <w:p>
             <w:pPr>
-              <w:spacing w:after="40" w:before="40" w:line="240" w:lineRule="auto"/>
+              <w:spacing w:after="20" w:before="20" w:line="245" w:lineRule="auto"/>
             </w:pPr>
             <w:r>
               <w:rPr>
                 <w:b w:val="0"/>
                 <w:sz w:val="20"/>
+                <w:color w:val="242021"/>
               </w:rPr>
               <w:t>Implementa extremo APEX y acceso a documentos</w:t>
             </w:r>
@@ -2104,7 +2208,7 @@
         </w:tc>
         <w:tc>
           <w:tcPr>
-            <w:tcW w:type="dxa" w:w="3024"/>
+            <w:tcW w:type="dxa" w:w="2981"/>
             <w:vAlign w:val="center"/>
             <w:shd w:fill="FFFFFF"/>
             <w:tcMar>
@@ -2116,12 +2220,13 @@
           </w:tcPr>
           <w:p>
             <w:pPr>
-              <w:spacing w:after="40" w:before="40" w:line="240" w:lineRule="auto"/>
+              <w:spacing w:after="20" w:before="20" w:line="245" w:lineRule="auto"/>
             </w:pPr>
             <w:r>
               <w:rPr>
                 <w:b w:val="0"/>
                 <w:sz w:val="20"/>
+                <w:color w:val="242021"/>
               </w:rPr>
               <w:t>Valida recorrido y datos</w:t>
             </w:r>
@@ -2134,9 +2239,9 @@
         </w:trPr>
         <w:tc>
           <w:tcPr>
-            <w:tcW w:type="dxa" w:w="2232"/>
+            <w:tcW w:type="dxa" w:w="2200"/>
             <w:vAlign w:val="center"/>
-            <w:shd w:fill="F5F7F9"/>
+            <w:shd w:fill="F5F5F5"/>
             <w:tcMar>
               <w:top w:w="85" w:type="dxa"/>
               <w:left w:w="85" w:type="dxa"/>
@@ -2146,12 +2251,13 @@
           </w:tcPr>
           <w:p>
             <w:pPr>
-              <w:spacing w:after="40" w:before="40" w:line="240" w:lineRule="auto"/>
+              <w:spacing w:after="20" w:before="20" w:line="245" w:lineRule="auto"/>
             </w:pPr>
             <w:r>
               <w:rPr>
                 <w:b w:val="0"/>
                 <w:sz w:val="20"/>
+                <w:color w:val="242021"/>
               </w:rPr>
               <w:t>Servidores y base de datos</w:t>
             </w:r>
@@ -2159,9 +2265,9 @@
         </w:tc>
         <w:tc>
           <w:tcPr>
-            <w:tcW w:type="dxa" w:w="2376"/>
+            <w:tcW w:type="dxa" w:w="2342"/>
             <w:vAlign w:val="center"/>
-            <w:shd w:fill="F5F7F9"/>
+            <w:shd w:fill="F5F5F5"/>
             <w:tcMar>
               <w:top w:w="85" w:type="dxa"/>
               <w:left w:w="85" w:type="dxa"/>
@@ -2171,12 +2277,13 @@
           </w:tcPr>
           <w:p>
             <w:pPr>
-              <w:spacing w:after="40" w:before="40" w:line="240" w:lineRule="auto"/>
+              <w:spacing w:after="20" w:before="20" w:line="245" w:lineRule="auto"/>
             </w:pPr>
             <w:r>
               <w:rPr>
                 <w:b w:val="0"/>
                 <w:sz w:val="20"/>
+                <w:color w:val="242021"/>
               </w:rPr>
               <w:t>Define necesidades y despliega aplicación</w:t>
             </w:r>
@@ -2184,9 +2291,9 @@
         </w:tc>
         <w:tc>
           <w:tcPr>
-            <w:tcW w:type="dxa" w:w="2448"/>
+            <w:tcW w:type="dxa" w:w="2413"/>
             <w:vAlign w:val="center"/>
-            <w:shd w:fill="F5F7F9"/>
+            <w:shd w:fill="F5F5F5"/>
             <w:tcMar>
               <w:top w:w="85" w:type="dxa"/>
               <w:left w:w="85" w:type="dxa"/>
@@ -2196,12 +2303,13 @@
           </w:tcPr>
           <w:p>
             <w:pPr>
-              <w:spacing w:after="40" w:before="40" w:line="240" w:lineRule="auto"/>
+              <w:spacing w:after="20" w:before="20" w:line="245" w:lineRule="auto"/>
             </w:pPr>
             <w:r>
               <w:rPr>
                 <w:b w:val="0"/>
                 <w:sz w:val="20"/>
+                <w:color w:val="242021"/>
               </w:rPr>
               <w:t>Provisiona, administra y respalda</w:t>
             </w:r>
@@ -2209,9 +2317,9 @@
         </w:tc>
         <w:tc>
           <w:tcPr>
-            <w:tcW w:type="dxa" w:w="3024"/>
+            <w:tcW w:type="dxa" w:w="2981"/>
             <w:vAlign w:val="center"/>
-            <w:shd w:fill="F5F7F9"/>
+            <w:shd w:fill="F5F5F5"/>
             <w:tcMar>
               <w:top w:w="85" w:type="dxa"/>
               <w:left w:w="85" w:type="dxa"/>
@@ -2221,12 +2329,13 @@
           </w:tcPr>
           <w:p>
             <w:pPr>
-              <w:spacing w:after="40" w:before="40" w:line="240" w:lineRule="auto"/>
+              <w:spacing w:after="20" w:before="20" w:line="245" w:lineRule="auto"/>
             </w:pPr>
             <w:r>
               <w:rPr>
                 <w:b w:val="0"/>
                 <w:sz w:val="20"/>
+                <w:color w:val="242021"/>
               </w:rPr>
               <w:t>Coordina disponibilidad</w:t>
             </w:r>
@@ -2239,7 +2348,7 @@
         </w:trPr>
         <w:tc>
           <w:tcPr>
-            <w:tcW w:type="dxa" w:w="2232"/>
+            <w:tcW w:type="dxa" w:w="2200"/>
             <w:vAlign w:val="center"/>
             <w:shd w:fill="FFFFFF"/>
             <w:tcMar>
@@ -2251,12 +2360,13 @@
           </w:tcPr>
           <w:p>
             <w:pPr>
-              <w:spacing w:after="40" w:before="40" w:line="240" w:lineRule="auto"/>
+              <w:spacing w:after="20" w:before="20" w:line="245" w:lineRule="auto"/>
             </w:pPr>
             <w:r>
               <w:rPr>
                 <w:b w:val="0"/>
                 <w:sz w:val="20"/>
+                <w:color w:val="242021"/>
               </w:rPr>
               <w:t>Gemini y tratamiento de datos</w:t>
             </w:r>
@@ -2264,7 +2374,7 @@
         </w:tc>
         <w:tc>
           <w:tcPr>
-            <w:tcW w:type="dxa" w:w="2376"/>
+            <w:tcW w:type="dxa" w:w="2342"/>
             <w:vAlign w:val="center"/>
             <w:shd w:fill="FFFFFF"/>
             <w:tcMar>
@@ -2276,12 +2386,13 @@
           </w:tcPr>
           <w:p>
             <w:pPr>
-              <w:spacing w:after="40" w:before="40" w:line="240" w:lineRule="auto"/>
+              <w:spacing w:after="20" w:before="20" w:line="245" w:lineRule="auto"/>
             </w:pPr>
             <w:r>
               <w:rPr>
                 <w:b w:val="0"/>
                 <w:sz w:val="20"/>
+                <w:color w:val="242021"/>
               </w:rPr>
               <w:t>Integra y controla ejecución</w:t>
             </w:r>
@@ -2289,7 +2400,7 @@
         </w:tc>
         <w:tc>
           <w:tcPr>
-            <w:tcW w:type="dxa" w:w="2448"/>
+            <w:tcW w:type="dxa" w:w="2413"/>
             <w:vAlign w:val="center"/>
             <w:shd w:fill="FFFFFF"/>
             <w:tcMar>
@@ -2301,12 +2412,13 @@
           </w:tcPr>
           <w:p>
             <w:pPr>
-              <w:spacing w:after="40" w:before="40" w:line="240" w:lineRule="auto"/>
+              <w:spacing w:after="20" w:before="20" w:line="245" w:lineRule="auto"/>
             </w:pPr>
             <w:r>
               <w:rPr>
                 <w:b w:val="0"/>
                 <w:sz w:val="20"/>
+                <w:color w:val="242021"/>
               </w:rPr>
               <w:t>Habilita proyecto, cuotas y credenciales</w:t>
             </w:r>
@@ -2314,7 +2426,7 @@
         </w:tc>
         <w:tc>
           <w:tcPr>
-            <w:tcW w:type="dxa" w:w="3024"/>
+            <w:tcW w:type="dxa" w:w="2981"/>
             <w:vAlign w:val="center"/>
             <w:shd w:fill="FFFFFF"/>
             <w:tcMar>
@@ -2326,12 +2438,13 @@
           </w:tcPr>
           <w:p>
             <w:pPr>
-              <w:spacing w:after="40" w:before="40" w:line="240" w:lineRule="auto"/>
+              <w:spacing w:after="20" w:before="20" w:line="245" w:lineRule="auto"/>
             </w:pPr>
             <w:r>
               <w:rPr>
                 <w:b w:val="0"/>
                 <w:sz w:val="20"/>
+                <w:color w:val="242021"/>
               </w:rPr>
               <w:t>Autoriza con Seguridad los usos y datos</w:t>
             </w:r>
@@ -2344,9 +2457,9 @@
         </w:trPr>
         <w:tc>
           <w:tcPr>
-            <w:tcW w:type="dxa" w:w="2232"/>
+            <w:tcW w:type="dxa" w:w="2200"/>
             <w:vAlign w:val="center"/>
-            <w:shd w:fill="F5F7F9"/>
+            <w:shd w:fill="F5F5F5"/>
             <w:tcMar>
               <w:top w:w="85" w:type="dxa"/>
               <w:left w:w="85" w:type="dxa"/>
@@ -2356,12 +2469,13 @@
           </w:tcPr>
           <w:p>
             <w:pPr>
-              <w:spacing w:after="40" w:before="40" w:line="240" w:lineRule="auto"/>
+              <w:spacing w:after="20" w:before="20" w:line="245" w:lineRule="auto"/>
             </w:pPr>
             <w:r>
               <w:rPr>
                 <w:b w:val="0"/>
                 <w:sz w:val="20"/>
+                <w:color w:val="242021"/>
               </w:rPr>
               <w:t>Auditoría</w:t>
             </w:r>
@@ -2369,9 +2483,9 @@
         </w:tc>
         <w:tc>
           <w:tcPr>
-            <w:tcW w:type="dxa" w:w="2376"/>
+            <w:tcW w:type="dxa" w:w="2342"/>
             <w:vAlign w:val="center"/>
-            <w:shd w:fill="F5F7F9"/>
+            <w:shd w:fill="F5F5F5"/>
             <w:tcMar>
               <w:top w:w="85" w:type="dxa"/>
               <w:left w:w="85" w:type="dxa"/>
@@ -2381,12 +2495,13 @@
           </w:tcPr>
           <w:p>
             <w:pPr>
-              <w:spacing w:after="40" w:before="40" w:line="240" w:lineRule="auto"/>
+              <w:spacing w:after="20" w:before="20" w:line="245" w:lineRule="auto"/>
             </w:pPr>
             <w:r>
               <w:rPr>
                 <w:b w:val="0"/>
                 <w:sz w:val="20"/>
+                <w:color w:val="242021"/>
               </w:rPr>
               <w:t>Registra análisis y cambios del motor</w:t>
             </w:r>
@@ -2394,9 +2509,9 @@
         </w:tc>
         <w:tc>
           <w:tcPr>
-            <w:tcW w:type="dxa" w:w="2448"/>
+            <w:tcW w:type="dxa" w:w="2413"/>
             <w:vAlign w:val="center"/>
-            <w:shd w:fill="F5F7F9"/>
+            <w:shd w:fill="F5F5F5"/>
             <w:tcMar>
               <w:top w:w="85" w:type="dxa"/>
               <w:left w:w="85" w:type="dxa"/>
@@ -2406,12 +2521,13 @@
           </w:tcPr>
           <w:p>
             <w:pPr>
-              <w:spacing w:after="40" w:before="40" w:line="240" w:lineRule="auto"/>
+              <w:spacing w:after="20" w:before="20" w:line="245" w:lineRule="auto"/>
             </w:pPr>
             <w:r>
               <w:rPr>
                 <w:b w:val="0"/>
                 <w:sz w:val="20"/>
+                <w:color w:val="242021"/>
               </w:rPr>
               <w:t>Registra acciones de APEX y resguarda registros</w:t>
             </w:r>
@@ -2419,9 +2535,9 @@
         </w:tc>
         <w:tc>
           <w:tcPr>
-            <w:tcW w:type="dxa" w:w="3024"/>
+            <w:tcW w:type="dxa" w:w="2981"/>
             <w:vAlign w:val="center"/>
-            <w:shd w:fill="F5F7F9"/>
+            <w:shd w:fill="F5F5F5"/>
             <w:tcMar>
               <w:top w:w="85" w:type="dxa"/>
               <w:left w:w="85" w:type="dxa"/>
@@ -2431,12 +2547,13 @@
           </w:tcPr>
           <w:p>
             <w:pPr>
-              <w:spacing w:after="40" w:before="40" w:line="240" w:lineRule="auto"/>
+              <w:spacing w:after="20" w:before="20" w:line="245" w:lineRule="auto"/>
             </w:pPr>
             <w:r>
               <w:rPr>
                 <w:b w:val="0"/>
                 <w:sz w:val="20"/>
+                <w:color w:val="242021"/>
               </w:rPr>
               <w:t>Define retención y consulta</w:t>
             </w:r>
@@ -2449,7 +2566,7 @@
         </w:trPr>
         <w:tc>
           <w:tcPr>
-            <w:tcW w:type="dxa" w:w="2232"/>
+            <w:tcW w:type="dxa" w:w="2200"/>
             <w:vAlign w:val="center"/>
             <w:shd w:fill="FFFFFF"/>
             <w:tcMar>
@@ -2461,12 +2578,13 @@
           </w:tcPr>
           <w:p>
             <w:pPr>
-              <w:spacing w:after="40" w:before="40" w:line="240" w:lineRule="auto"/>
+              <w:spacing w:after="20" w:before="20" w:line="245" w:lineRule="auto"/>
             </w:pPr>
             <w:r>
               <w:rPr>
                 <w:b w:val="0"/>
                 <w:sz w:val="20"/>
+                <w:color w:val="242021"/>
               </w:rPr>
               <w:t>Pruebas integrales</w:t>
             </w:r>
@@ -2474,7 +2592,7 @@
         </w:tc>
         <w:tc>
           <w:tcPr>
-            <w:tcW w:type="dxa" w:w="2376"/>
+            <w:tcW w:type="dxa" w:w="2342"/>
             <w:vAlign w:val="center"/>
             <w:shd w:fill="FFFFFF"/>
             <w:tcMar>
@@ -2486,12 +2604,13 @@
           </w:tcPr>
           <w:p>
             <w:pPr>
-              <w:spacing w:after="40" w:before="40" w:line="240" w:lineRule="auto"/>
+              <w:spacing w:after="20" w:before="20" w:line="245" w:lineRule="auto"/>
             </w:pPr>
             <w:r>
               <w:rPr>
                 <w:b w:val="0"/>
                 <w:sz w:val="20"/>
+                <w:color w:val="242021"/>
               </w:rPr>
               <w:t>Prueba y corrige su componente</w:t>
             </w:r>
@@ -2499,7 +2618,7 @@
         </w:tc>
         <w:tc>
           <w:tcPr>
-            <w:tcW w:type="dxa" w:w="2448"/>
+            <w:tcW w:type="dxa" w:w="2413"/>
             <w:vAlign w:val="center"/>
             <w:shd w:fill="FFFFFF"/>
             <w:tcMar>
@@ -2511,12 +2630,13 @@
           </w:tcPr>
           <w:p>
             <w:pPr>
-              <w:spacing w:after="40" w:before="40" w:line="240" w:lineRule="auto"/>
+              <w:spacing w:after="20" w:before="20" w:line="245" w:lineRule="auto"/>
             </w:pPr>
             <w:r>
               <w:rPr>
                 <w:b w:val="0"/>
                 <w:sz w:val="20"/>
+                <w:color w:val="242021"/>
               </w:rPr>
               <w:t>Prueba y corrige su componente</w:t>
             </w:r>
@@ -2524,7 +2644,7 @@
         </w:tc>
         <w:tc>
           <w:tcPr>
-            <w:tcW w:type="dxa" w:w="3024"/>
+            <w:tcW w:type="dxa" w:w="2981"/>
             <w:vAlign w:val="center"/>
             <w:shd w:fill="FFFFFF"/>
             <w:tcMar>
@@ -2536,12 +2656,13 @@
           </w:tcPr>
           <w:p>
             <w:pPr>
-              <w:spacing w:after="40" w:before="40" w:line="240" w:lineRule="auto"/>
+              <w:spacing w:after="20" w:before="20" w:line="245" w:lineRule="auto"/>
             </w:pPr>
             <w:r>
               <w:rPr>
                 <w:b w:val="0"/>
                 <w:sz w:val="20"/>
+                <w:color w:val="242021"/>
               </w:rPr>
               <w:t>Ejecuta UAT y acepta funcionalmente</w:t>
             </w:r>
@@ -2554,9 +2675,9 @@
         </w:trPr>
         <w:tc>
           <w:tcPr>
-            <w:tcW w:type="dxa" w:w="2232"/>
+            <w:tcW w:type="dxa" w:w="2200"/>
             <w:vAlign w:val="center"/>
-            <w:shd w:fill="F5F7F9"/>
+            <w:shd w:fill="F5F5F5"/>
             <w:tcMar>
               <w:top w:w="85" w:type="dxa"/>
               <w:left w:w="85" w:type="dxa"/>
@@ -2566,12 +2687,13 @@
           </w:tcPr>
           <w:p>
             <w:pPr>
-              <w:spacing w:after="40" w:before="40" w:line="240" w:lineRule="auto"/>
+              <w:spacing w:after="20" w:before="20" w:line="245" w:lineRule="auto"/>
             </w:pPr>
             <w:r>
               <w:rPr>
                 <w:b w:val="0"/>
                 <w:sz w:val="20"/>
+                <w:color w:val="242021"/>
               </w:rPr>
               <w:t>Puesta en producción</w:t>
             </w:r>
@@ -2579,9 +2701,9 @@
         </w:tc>
         <w:tc>
           <w:tcPr>
-            <w:tcW w:type="dxa" w:w="2376"/>
+            <w:tcW w:type="dxa" w:w="2342"/>
             <w:vAlign w:val="center"/>
-            <w:shd w:fill="F5F7F9"/>
+            <w:shd w:fill="F5F5F5"/>
             <w:tcMar>
               <w:top w:w="85" w:type="dxa"/>
               <w:left w:w="85" w:type="dxa"/>
@@ -2591,12 +2713,13 @@
           </w:tcPr>
           <w:p>
             <w:pPr>
-              <w:spacing w:after="40" w:before="40" w:line="240" w:lineRule="auto"/>
+              <w:spacing w:after="20" w:before="20" w:line="245" w:lineRule="auto"/>
             </w:pPr>
             <w:r>
               <w:rPr>
                 <w:b w:val="0"/>
                 <w:sz w:val="20"/>
+                <w:color w:val="242021"/>
               </w:rPr>
               <w:t>Instala y verifica solución MACAO</w:t>
             </w:r>
@@ -2604,9 +2727,9 @@
         </w:tc>
         <w:tc>
           <w:tcPr>
-            <w:tcW w:type="dxa" w:w="2448"/>
+            <w:tcW w:type="dxa" w:w="2413"/>
             <w:vAlign w:val="center"/>
-            <w:shd w:fill="F5F7F9"/>
+            <w:shd w:fill="F5F5F5"/>
             <w:tcMar>
               <w:top w:w="85" w:type="dxa"/>
               <w:left w:w="85" w:type="dxa"/>
@@ -2616,12 +2739,13 @@
           </w:tcPr>
           <w:p>
             <w:pPr>
-              <w:spacing w:after="40" w:before="40" w:line="240" w:lineRule="auto"/>
+              <w:spacing w:after="20" w:before="20" w:line="245" w:lineRule="auto"/>
             </w:pPr>
             <w:r>
               <w:rPr>
                 <w:b w:val="0"/>
                 <w:sz w:val="20"/>
+                <w:color w:val="242021"/>
               </w:rPr>
               <w:t>Autoriza y ejecuta controles del ambiente</w:t>
             </w:r>
@@ -2629,9 +2753,9 @@
         </w:tc>
         <w:tc>
           <w:tcPr>
-            <w:tcW w:type="dxa" w:w="3024"/>
+            <w:tcW w:type="dxa" w:w="2981"/>
             <w:vAlign w:val="center"/>
-            <w:shd w:fill="F5F7F9"/>
+            <w:shd w:fill="F5F5F5"/>
             <w:tcMar>
               <w:top w:w="85" w:type="dxa"/>
               <w:left w:w="85" w:type="dxa"/>
@@ -2641,12 +2765,13 @@
           </w:tcPr>
           <w:p>
             <w:pPr>
-              <w:spacing w:after="40" w:before="40" w:line="240" w:lineRule="auto"/>
+              <w:spacing w:after="20" w:before="20" w:line="245" w:lineRule="auto"/>
             </w:pPr>
             <w:r>
               <w:rPr>
                 <w:b w:val="0"/>
                 <w:sz w:val="20"/>
+                <w:color w:val="242021"/>
               </w:rPr>
               <w:t>Autoriza inicio operativo</w:t>
             </w:r>
@@ -2659,7 +2784,7 @@
         </w:trPr>
         <w:tc>
           <w:tcPr>
-            <w:tcW w:type="dxa" w:w="2232"/>
+            <w:tcW w:type="dxa" w:w="2200"/>
             <w:vAlign w:val="center"/>
             <w:shd w:fill="FFFFFF"/>
             <w:tcMar>
@@ -2671,12 +2796,13 @@
           </w:tcPr>
           <w:p>
             <w:pPr>
-              <w:spacing w:after="40" w:before="40" w:line="240" w:lineRule="auto"/>
+              <w:spacing w:after="20" w:before="20" w:line="245" w:lineRule="auto"/>
             </w:pPr>
             <w:r>
               <w:rPr>
                 <w:b w:val="0"/>
                 <w:sz w:val="20"/>
+                <w:color w:val="242021"/>
               </w:rPr>
               <w:t>Incidentes y continuidad</w:t>
             </w:r>
@@ -2684,7 +2810,7 @@
         </w:tc>
         <w:tc>
           <w:tcPr>
-            <w:tcW w:type="dxa" w:w="2376"/>
+            <w:tcW w:type="dxa" w:w="2342"/>
             <w:vAlign w:val="center"/>
             <w:shd w:fill="FFFFFF"/>
             <w:tcMar>
@@ -2696,12 +2822,13 @@
           </w:tcPr>
           <w:p>
             <w:pPr>
-              <w:spacing w:after="40" w:before="40" w:line="240" w:lineRule="auto"/>
+              <w:spacing w:after="20" w:before="20" w:line="245" w:lineRule="auto"/>
             </w:pPr>
             <w:r>
               <w:rPr>
                 <w:b w:val="0"/>
                 <w:sz w:val="20"/>
+                <w:color w:val="242021"/>
               </w:rPr>
               <w:t>Atiende defectos cubiertos y soporte contratado</w:t>
             </w:r>
@@ -2709,7 +2836,7 @@
         </w:tc>
         <w:tc>
           <w:tcPr>
-            <w:tcW w:type="dxa" w:w="2448"/>
+            <w:tcW w:type="dxa" w:w="2413"/>
             <w:vAlign w:val="center"/>
             <w:shd w:fill="FFFFFF"/>
             <w:tcMar>
@@ -2721,12 +2848,13 @@
           </w:tcPr>
           <w:p>
             <w:pPr>
-              <w:spacing w:after="40" w:before="40" w:line="240" w:lineRule="auto"/>
+              <w:spacing w:after="20" w:before="20" w:line="245" w:lineRule="auto"/>
             </w:pPr>
             <w:r>
               <w:rPr>
                 <w:b w:val="0"/>
                 <w:sz w:val="20"/>
+                <w:color w:val="242021"/>
               </w:rPr>
               <w:t>Atiende APEX, red, base y respaldos</w:t>
             </w:r>
@@ -2734,7 +2862,7 @@
         </w:tc>
         <w:tc>
           <w:tcPr>
-            <w:tcW w:type="dxa" w:w="3024"/>
+            <w:tcW w:type="dxa" w:w="2981"/>
             <w:vAlign w:val="center"/>
             <w:shd w:fill="FFFFFF"/>
             <w:tcMar>
@@ -2746,12 +2874,13 @@
           </w:tcPr>
           <w:p>
             <w:pPr>
-              <w:spacing w:after="40" w:before="40" w:line="240" w:lineRule="auto"/>
+              <w:spacing w:after="20" w:before="20" w:line="245" w:lineRule="auto"/>
             </w:pPr>
             <w:r>
               <w:rPr>
                 <w:b w:val="0"/>
                 <w:sz w:val="20"/>
+                <w:color w:val="242021"/>
               </w:rPr>
               <w:t>Reporta impacto y prioriza</w:t>
             </w:r>
@@ -2799,9 +2928,9 @@
         </w:tblBorders>
       </w:tblPr>
       <w:tblGrid>
-        <w:gridCol w:w="864"/>
-        <w:gridCol w:w="4680"/>
-        <w:gridCol w:w="4536"/>
+        <w:gridCol w:w="852"/>
+        <w:gridCol w:w="4613"/>
+        <w:gridCol w:w="4471"/>
       </w:tblGrid>
       <w:tr>
         <w:trPr>
@@ -2810,24 +2939,28 @@
         </w:trPr>
         <w:tc>
           <w:tcPr>
-            <w:tcW w:type="dxa" w:w="864"/>
+            <w:tcW w:type="dxa" w:w="852"/>
             <w:vAlign w:val="center"/>
-            <w:shd w:fill="DCE6ED"/>
+            <w:shd w:fill="242021"/>
             <w:tcMar>
               <w:top w:w="85" w:type="dxa"/>
               <w:left w:w="85" w:type="dxa"/>
               <w:bottom w:w="85" w:type="dxa"/>
               <w:right w:w="85" w:type="dxa"/>
             </w:tcMar>
+            <w:tcBorders>
+              <w:bottom w:val="single" w:sz="8" w:color="FF0006"/>
+            </w:tcBorders>
           </w:tcPr>
           <w:p>
             <w:pPr>
-              <w:spacing w:after="40" w:before="40" w:line="240" w:lineRule="auto"/>
+              <w:spacing w:after="20" w:before="20" w:line="245" w:lineRule="auto"/>
             </w:pPr>
             <w:r>
               <w:rPr>
                 <w:b/>
                 <w:sz w:val="20"/>
+                <w:color w:val="FFFFFF"/>
               </w:rPr>
               <w:t>Semana</w:t>
             </w:r>
@@ -2835,24 +2968,28 @@
         </w:tc>
         <w:tc>
           <w:tcPr>
-            <w:tcW w:type="dxa" w:w="4680"/>
+            <w:tcW w:type="dxa" w:w="4613"/>
             <w:vAlign w:val="center"/>
-            <w:shd w:fill="DCE6ED"/>
+            <w:shd w:fill="242021"/>
             <w:tcMar>
               <w:top w:w="85" w:type="dxa"/>
               <w:left w:w="85" w:type="dxa"/>
               <w:bottom w:w="85" w:type="dxa"/>
               <w:right w:w="85" w:type="dxa"/>
             </w:tcMar>
+            <w:tcBorders>
+              <w:bottom w:val="single" w:sz="8" w:color="FF0006"/>
+            </w:tcBorders>
           </w:tcPr>
           <w:p>
             <w:pPr>
-              <w:spacing w:after="40" w:before="40" w:line="240" w:lineRule="auto"/>
+              <w:spacing w:after="20" w:before="20" w:line="245" w:lineRule="auto"/>
             </w:pPr>
             <w:r>
               <w:rPr>
                 <w:b/>
                 <w:sz w:val="20"/>
+                <w:color w:val="FFFFFF"/>
               </w:rPr>
               <w:t>Entrega de MACAO</w:t>
             </w:r>
@@ -2860,24 +2997,28 @@
         </w:tc>
         <w:tc>
           <w:tcPr>
-            <w:tcW w:type="dxa" w:w="4536"/>
+            <w:tcW w:type="dxa" w:w="4471"/>
             <w:vAlign w:val="center"/>
-            <w:shd w:fill="DCE6ED"/>
+            <w:shd w:fill="242021"/>
             <w:tcMar>
               <w:top w:w="85" w:type="dxa"/>
               <w:left w:w="85" w:type="dxa"/>
               <w:bottom w:w="85" w:type="dxa"/>
               <w:right w:w="85" w:type="dxa"/>
             </w:tcMar>
+            <w:tcBorders>
+              <w:bottom w:val="single" w:sz="8" w:color="FF0006"/>
+            </w:tcBorders>
           </w:tcPr>
           <w:p>
             <w:pPr>
-              <w:spacing w:after="40" w:before="40" w:line="240" w:lineRule="auto"/>
+              <w:spacing w:after="20" w:before="20" w:line="245" w:lineRule="auto"/>
             </w:pPr>
             <w:r>
               <w:rPr>
                 <w:b/>
                 <w:sz w:val="20"/>
+                <w:color w:val="FFFFFF"/>
               </w:rPr>
               <w:t>Participación del banco</w:t>
             </w:r>
@@ -2890,7 +3031,7 @@
         </w:trPr>
         <w:tc>
           <w:tcPr>
-            <w:tcW w:type="dxa" w:w="864"/>
+            <w:tcW w:type="dxa" w:w="852"/>
             <w:vAlign w:val="center"/>
             <w:shd w:fill="FFFFFF"/>
             <w:tcMar>
@@ -2902,12 +3043,13 @@
           </w:tcPr>
           <w:p>
             <w:pPr>
-              <w:spacing w:after="40" w:before="40" w:line="240" w:lineRule="auto"/>
+              <w:spacing w:after="20" w:before="20" w:line="245" w:lineRule="auto"/>
             </w:pPr>
             <w:r>
               <w:rPr>
                 <w:b w:val="0"/>
                 <w:sz w:val="20"/>
+                <w:color w:val="242021"/>
               </w:rPr>
               <w:t>1</w:t>
             </w:r>
@@ -2915,7 +3057,7 @@
         </w:tc>
         <w:tc>
           <w:tcPr>
-            <w:tcW w:type="dxa" w:w="4680"/>
+            <w:tcW w:type="dxa" w:w="4613"/>
             <w:vAlign w:val="center"/>
             <w:shd w:fill="FFFFFF"/>
             <w:tcMar>
@@ -2927,12 +3069,13 @@
           </w:tcPr>
           <w:p>
             <w:pPr>
-              <w:spacing w:after="40" w:before="40" w:line="240" w:lineRule="auto"/>
+              <w:spacing w:after="20" w:before="20" w:line="245" w:lineRule="auto"/>
             </w:pPr>
             <w:r>
               <w:rPr>
                 <w:b w:val="0"/>
                 <w:sz w:val="20"/>
+                <w:color w:val="242021"/>
               </w:rPr>
               <w:t>Alcance, matriz de reglas, arquitectura, diseño del portal, contrato API y criterios UAT.</w:t>
             </w:r>
@@ -2940,7 +3083,7 @@
         </w:tc>
         <w:tc>
           <w:tcPr>
-            <w:tcW w:type="dxa" w:w="4536"/>
+            <w:tcW w:type="dxa" w:w="4471"/>
             <w:vAlign w:val="center"/>
             <w:shd w:fill="FFFFFF"/>
             <w:tcMar>
@@ -2952,12 +3095,13 @@
           </w:tcPr>
           <w:p>
             <w:pPr>
-              <w:spacing w:after="40" w:before="40" w:line="240" w:lineRule="auto"/>
+              <w:spacing w:after="20" w:before="20" w:line="245" w:lineRule="auto"/>
             </w:pPr>
             <w:r>
               <w:rPr>
                 <w:b w:val="0"/>
                 <w:sz w:val="20"/>
+                <w:color w:val="242021"/>
               </w:rPr>
               <w:t>Confirma versiones, muestras, reglas, responsables, servicios y calendario.</w:t>
             </w:r>
@@ -2970,9 +3114,9 @@
         </w:trPr>
         <w:tc>
           <w:tcPr>
-            <w:tcW w:type="dxa" w:w="864"/>
+            <w:tcW w:type="dxa" w:w="852"/>
             <w:vAlign w:val="center"/>
-            <w:shd w:fill="F5F7F9"/>
+            <w:shd w:fill="F5F5F5"/>
             <w:tcMar>
               <w:top w:w="85" w:type="dxa"/>
               <w:left w:w="85" w:type="dxa"/>
@@ -2982,12 +3126,13 @@
           </w:tcPr>
           <w:p>
             <w:pPr>
-              <w:spacing w:after="40" w:before="40" w:line="240" w:lineRule="auto"/>
+              <w:spacing w:after="20" w:before="20" w:line="245" w:lineRule="auto"/>
             </w:pPr>
             <w:r>
               <w:rPr>
                 <w:b w:val="0"/>
                 <w:sz w:val="20"/>
+                <w:color w:val="242021"/>
               </w:rPr>
               <w:t>2</w:t>
             </w:r>
@@ -2995,9 +3140,9 @@
         </w:tc>
         <w:tc>
           <w:tcPr>
-            <w:tcW w:type="dxa" w:w="4680"/>
+            <w:tcW w:type="dxa" w:w="4613"/>
             <w:vAlign w:val="center"/>
-            <w:shd w:fill="F5F7F9"/>
+            <w:shd w:fill="F5F5F5"/>
             <w:tcMar>
               <w:top w:w="85" w:type="dxa"/>
               <w:left w:w="85" w:type="dxa"/>
@@ -3007,12 +3152,13 @@
           </w:tcPr>
           <w:p>
             <w:pPr>
-              <w:spacing w:after="40" w:before="40" w:line="240" w:lineRule="auto"/>
+              <w:spacing w:after="20" w:before="20" w:line="245" w:lineRule="auto"/>
             </w:pPr>
             <w:r>
               <w:rPr>
                 <w:b w:val="0"/>
                 <w:sz w:val="20"/>
+                <w:color w:val="242021"/>
               </w:rPr>
               <w:t>Ambiente base, acceso al portal, estructura de configuración y primer intercambio de prueba.</w:t>
             </w:r>
@@ -3020,9 +3166,9 @@
         </w:tc>
         <w:tc>
           <w:tcPr>
-            <w:tcW w:type="dxa" w:w="4536"/>
+            <w:tcW w:type="dxa" w:w="4471"/>
             <w:vAlign w:val="center"/>
-            <w:shd w:fill="F5F7F9"/>
+            <w:shd w:fill="F5F5F5"/>
             <w:tcMar>
               <w:top w:w="85" w:type="dxa"/>
               <w:left w:w="85" w:type="dxa"/>
@@ -3032,12 +3178,13 @@
           </w:tcPr>
           <w:p>
             <w:pPr>
-              <w:spacing w:after="40" w:before="40" w:line="240" w:lineRule="auto"/>
+              <w:spacing w:after="20" w:before="20" w:line="245" w:lineRule="auto"/>
             </w:pPr>
             <w:r>
               <w:rPr>
                 <w:b w:val="0"/>
                 <w:sz w:val="20"/>
+                <w:color w:val="242021"/>
               </w:rPr>
               <w:t>Habilita ambientes, base, documentos, Gemini y conexión APEX.</w:t>
             </w:r>
@@ -3050,7 +3197,7 @@
         </w:trPr>
         <w:tc>
           <w:tcPr>
-            <w:tcW w:type="dxa" w:w="864"/>
+            <w:tcW w:type="dxa" w:w="852"/>
             <w:vAlign w:val="center"/>
             <w:shd w:fill="FFFFFF"/>
             <w:tcMar>
@@ -3062,12 +3209,13 @@
           </w:tcPr>
           <w:p>
             <w:pPr>
-              <w:spacing w:after="40" w:before="40" w:line="240" w:lineRule="auto"/>
+              <w:spacing w:after="20" w:before="20" w:line="245" w:lineRule="auto"/>
             </w:pPr>
             <w:r>
               <w:rPr>
                 <w:b w:val="0"/>
                 <w:sz w:val="20"/>
+                <w:color w:val="242021"/>
               </w:rPr>
               <w:t>3</w:t>
             </w:r>
@@ -3075,7 +3223,7 @@
         </w:tc>
         <w:tc>
           <w:tcPr>
-            <w:tcW w:type="dxa" w:w="4680"/>
+            <w:tcW w:type="dxa" w:w="4613"/>
             <w:vAlign w:val="center"/>
             <w:shd w:fill="FFFFFF"/>
             <w:tcMar>
@@ -3087,12 +3235,13 @@
           </w:tcPr>
           <w:p>
             <w:pPr>
-              <w:spacing w:after="40" w:before="40" w:line="240" w:lineRule="auto"/>
+              <w:spacing w:after="20" w:before="20" w:line="245" w:lineRule="auto"/>
             </w:pPr>
             <w:r>
               <w:rPr>
                 <w:b w:val="0"/>
                 <w:sz w:val="20"/>
+                <w:color w:val="242021"/>
               </w:rPr>
               <w:t>Clasificación, extracción y pantallas de matrices y reglas.</w:t>
             </w:r>
@@ -3100,7 +3249,7 @@
         </w:tc>
         <w:tc>
           <w:tcPr>
-            <w:tcW w:type="dxa" w:w="4536"/>
+            <w:tcW w:type="dxa" w:w="4471"/>
             <w:vAlign w:val="center"/>
             <w:shd w:fill="FFFFFF"/>
             <w:tcMar>
@@ -3112,12 +3261,13 @@
           </w:tcPr>
           <w:p>
             <w:pPr>
-              <w:spacing w:after="40" w:before="40" w:line="240" w:lineRule="auto"/>
+              <w:spacing w:after="20" w:before="20" w:line="245" w:lineRule="auto"/>
             </w:pPr>
             <w:r>
               <w:rPr>
                 <w:b w:val="0"/>
                 <w:sz w:val="20"/>
+                <w:color w:val="242021"/>
               </w:rPr>
               <w:t>Prueba intercambio y valida resultados con muestras.</w:t>
             </w:r>
@@ -3130,9 +3280,9 @@
         </w:trPr>
         <w:tc>
           <w:tcPr>
-            <w:tcW w:type="dxa" w:w="864"/>
+            <w:tcW w:type="dxa" w:w="852"/>
             <w:vAlign w:val="center"/>
-            <w:shd w:fill="F5F7F9"/>
+            <w:shd w:fill="F5F5F5"/>
             <w:tcMar>
               <w:top w:w="85" w:type="dxa"/>
               <w:left w:w="85" w:type="dxa"/>
@@ -3142,12 +3292,13 @@
           </w:tcPr>
           <w:p>
             <w:pPr>
-              <w:spacing w:after="40" w:before="40" w:line="240" w:lineRule="auto"/>
+              <w:spacing w:after="20" w:before="20" w:line="245" w:lineRule="auto"/>
             </w:pPr>
             <w:r>
               <w:rPr>
                 <w:b w:val="0"/>
                 <w:sz w:val="20"/>
+                <w:color w:val="242021"/>
               </w:rPr>
               <w:t>4</w:t>
             </w:r>
@@ -3155,9 +3306,9 @@
         </w:tc>
         <w:tc>
           <w:tcPr>
-            <w:tcW w:type="dxa" w:w="4680"/>
+            <w:tcW w:type="dxa" w:w="4613"/>
             <w:vAlign w:val="center"/>
-            <w:shd w:fill="F5F7F9"/>
+            <w:shd w:fill="F5F5F5"/>
             <w:tcMar>
               <w:top w:w="85" w:type="dxa"/>
               <w:left w:w="85" w:type="dxa"/>
@@ -3167,12 +3318,13 @@
           </w:tcPr>
           <w:p>
             <w:pPr>
-              <w:spacing w:after="40" w:before="40" w:line="240" w:lineRule="auto"/>
+              <w:spacing w:after="20" w:before="20" w:line="245" w:lineRule="auto"/>
             </w:pPr>
             <w:r>
               <w:rPr>
                 <w:b w:val="0"/>
                 <w:sz w:val="20"/>
+                <w:color w:val="242021"/>
               </w:rPr>
               <w:t>Consistencia, evidencia, versionado, publicación y auditoría.</w:t>
             </w:r>
@@ -3180,9 +3332,9 @@
         </w:tc>
         <w:tc>
           <w:tcPr>
-            <w:tcW w:type="dxa" w:w="4536"/>
+            <w:tcW w:type="dxa" w:w="4471"/>
             <w:vAlign w:val="center"/>
-            <w:shd w:fill="F5F7F9"/>
+            <w:shd w:fill="F5F5F5"/>
             <w:tcMar>
               <w:top w:w="85" w:type="dxa"/>
               <w:left w:w="85" w:type="dxa"/>
@@ -3192,12 +3344,13 @@
           </w:tcPr>
           <w:p>
             <w:pPr>
-              <w:spacing w:after="40" w:before="40" w:line="240" w:lineRule="auto"/>
+              <w:spacing w:after="20" w:before="20" w:line="245" w:lineRule="auto"/>
             </w:pPr>
             <w:r>
               <w:rPr>
                 <w:b w:val="0"/>
                 <w:sz w:val="20"/>
+                <w:color w:val="242021"/>
               </w:rPr>
               <w:t>Valida reglas y presenta resultados en APEX.</w:t>
             </w:r>
@@ -3210,7 +3363,7 @@
         </w:trPr>
         <w:tc>
           <w:tcPr>
-            <w:tcW w:type="dxa" w:w="864"/>
+            <w:tcW w:type="dxa" w:w="852"/>
             <w:vAlign w:val="center"/>
             <w:shd w:fill="FFFFFF"/>
             <w:tcMar>
@@ -3222,12 +3375,13 @@
           </w:tcPr>
           <w:p>
             <w:pPr>
-              <w:spacing w:after="40" w:before="40" w:line="240" w:lineRule="auto"/>
+              <w:spacing w:after="20" w:before="20" w:line="245" w:lineRule="auto"/>
             </w:pPr>
             <w:r>
               <w:rPr>
                 <w:b w:val="0"/>
                 <w:sz w:val="20"/>
+                <w:color w:val="242021"/>
               </w:rPr>
               <w:t>5</w:t>
             </w:r>
@@ -3235,7 +3389,7 @@
         </w:tc>
         <w:tc>
           <w:tcPr>
-            <w:tcW w:type="dxa" w:w="4680"/>
+            <w:tcW w:type="dxa" w:w="4613"/>
             <w:vAlign w:val="center"/>
             <w:shd w:fill="FFFFFF"/>
             <w:tcMar>
@@ -3247,12 +3401,13 @@
           </w:tcPr>
           <w:p>
             <w:pPr>
-              <w:spacing w:after="40" w:before="40" w:line="240" w:lineRule="auto"/>
+              <w:spacing w:after="20" w:before="20" w:line="245" w:lineRule="auto"/>
             </w:pPr>
             <w:r>
               <w:rPr>
                 <w:b w:val="0"/>
                 <w:sz w:val="20"/>
+                <w:color w:val="242021"/>
               </w:rPr>
               <w:t>Recorrido integrado, errores, duplicados y reprocesos.</w:t>
             </w:r>
@@ -3260,7 +3415,7 @@
         </w:tc>
         <w:tc>
           <w:tcPr>
-            <w:tcW w:type="dxa" w:w="4536"/>
+            <w:tcW w:type="dxa" w:w="4471"/>
             <w:vAlign w:val="center"/>
             <w:shd w:fill="FFFFFF"/>
             <w:tcMar>
@@ -3272,12 +3427,13 @@
           </w:tcPr>
           <w:p>
             <w:pPr>
-              <w:spacing w:after="40" w:before="40" w:line="240" w:lineRule="auto"/>
+              <w:spacing w:after="20" w:before="20" w:line="245" w:lineRule="auto"/>
             </w:pPr>
             <w:r>
               <w:rPr>
                 <w:b w:val="0"/>
                 <w:sz w:val="20"/>
+                <w:color w:val="242021"/>
               </w:rPr>
               <w:t>Completa su extremo y participa en pruebas conjuntas.</w:t>
             </w:r>
@@ -3290,9 +3446,9 @@
         </w:trPr>
         <w:tc>
           <w:tcPr>
-            <w:tcW w:type="dxa" w:w="864"/>
+            <w:tcW w:type="dxa" w:w="852"/>
             <w:vAlign w:val="center"/>
-            <w:shd w:fill="F5F7F9"/>
+            <w:shd w:fill="F5F5F5"/>
             <w:tcMar>
               <w:top w:w="85" w:type="dxa"/>
               <w:left w:w="85" w:type="dxa"/>
@@ -3302,12 +3458,13 @@
           </w:tcPr>
           <w:p>
             <w:pPr>
-              <w:spacing w:after="40" w:before="40" w:line="240" w:lineRule="auto"/>
+              <w:spacing w:after="20" w:before="20" w:line="245" w:lineRule="auto"/>
             </w:pPr>
             <w:r>
               <w:rPr>
                 <w:b w:val="0"/>
                 <w:sz w:val="20"/>
+                <w:color w:val="242021"/>
               </w:rPr>
               <w:t>6</w:t>
             </w:r>
@@ -3315,9 +3472,9 @@
         </w:tc>
         <w:tc>
           <w:tcPr>
-            <w:tcW w:type="dxa" w:w="4680"/>
+            <w:tcW w:type="dxa" w:w="4613"/>
             <w:vAlign w:val="center"/>
-            <w:shd w:fill="F5F7F9"/>
+            <w:shd w:fill="F5F5F5"/>
             <w:tcMar>
               <w:top w:w="85" w:type="dxa"/>
               <w:left w:w="85" w:type="dxa"/>
@@ -3327,12 +3484,13 @@
           </w:tcPr>
           <w:p>
             <w:pPr>
-              <w:spacing w:after="40" w:before="40" w:line="240" w:lineRule="auto"/>
+              <w:spacing w:after="20" w:before="20" w:line="245" w:lineRule="auto"/>
             </w:pPr>
             <w:r>
               <w:rPr>
                 <w:b w:val="0"/>
                 <w:sz w:val="20"/>
+                <w:color w:val="242021"/>
               </w:rPr>
               <w:t>Versión candidata y piloto controlado con portal y motor.</w:t>
             </w:r>
@@ -3340,9 +3498,9 @@
         </w:tc>
         <w:tc>
           <w:tcPr>
-            <w:tcW w:type="dxa" w:w="4536"/>
+            <w:tcW w:type="dxa" w:w="4471"/>
             <w:vAlign w:val="center"/>
-            <w:shd w:fill="F5F7F9"/>
+            <w:shd w:fill="F5F5F5"/>
             <w:tcMar>
               <w:top w:w="85" w:type="dxa"/>
               <w:left w:w="85" w:type="dxa"/>
@@ -3352,12 +3510,13 @@
           </w:tcPr>
           <w:p>
             <w:pPr>
-              <w:spacing w:after="40" w:before="40" w:line="240" w:lineRule="auto"/>
+              <w:spacing w:after="20" w:before="20" w:line="245" w:lineRule="auto"/>
             </w:pPr>
             <w:r>
               <w:rPr>
                 <w:b w:val="0"/>
                 <w:sz w:val="20"/>
+                <w:color w:val="242021"/>
               </w:rPr>
               <w:t>APEX disponible; valida recorrido con usuarios clave.</w:t>
             </w:r>
@@ -3370,7 +3529,7 @@
         </w:trPr>
         <w:tc>
           <w:tcPr>
-            <w:tcW w:type="dxa" w:w="864"/>
+            <w:tcW w:type="dxa" w:w="852"/>
             <w:vAlign w:val="center"/>
             <w:shd w:fill="FFFFFF"/>
             <w:tcMar>
@@ -3382,12 +3541,13 @@
           </w:tcPr>
           <w:p>
             <w:pPr>
-              <w:spacing w:after="40" w:before="40" w:line="240" w:lineRule="auto"/>
+              <w:spacing w:after="20" w:before="20" w:line="245" w:lineRule="auto"/>
             </w:pPr>
             <w:r>
               <w:rPr>
                 <w:b w:val="0"/>
                 <w:sz w:val="20"/>
+                <w:color w:val="242021"/>
               </w:rPr>
               <w:t>7</w:t>
             </w:r>
@@ -3395,7 +3555,7 @@
         </w:tc>
         <w:tc>
           <w:tcPr>
-            <w:tcW w:type="dxa" w:w="4680"/>
+            <w:tcW w:type="dxa" w:w="4613"/>
             <w:vAlign w:val="center"/>
             <w:shd w:fill="FFFFFF"/>
             <w:tcMar>
@@ -3407,12 +3567,13 @@
           </w:tcPr>
           <w:p>
             <w:pPr>
-              <w:spacing w:after="40" w:before="40" w:line="240" w:lineRule="auto"/>
+              <w:spacing w:after="20" w:before="20" w:line="245" w:lineRule="auto"/>
             </w:pPr>
             <w:r>
               <w:rPr>
                 <w:b w:val="0"/>
                 <w:sz w:val="20"/>
+                <w:color w:val="242021"/>
               </w:rPr>
               <w:t>UAT, seguridad y rendimiento acordados; correcciones y manuales.</w:t>
             </w:r>
@@ -3420,7 +3581,7 @@
         </w:tc>
         <w:tc>
           <w:tcPr>
-            <w:tcW w:type="dxa" w:w="4536"/>
+            <w:tcW w:type="dxa" w:w="4471"/>
             <w:vAlign w:val="center"/>
             <w:shd w:fill="FFFFFF"/>
             <w:tcMar>
@@ -3432,12 +3593,13 @@
           </w:tcPr>
           <w:p>
             <w:pPr>
-              <w:spacing w:after="40" w:before="40" w:line="240" w:lineRule="auto"/>
+              <w:spacing w:after="20" w:before="20" w:line="245" w:lineRule="auto"/>
             </w:pPr>
             <w:r>
               <w:rPr>
                 <w:b w:val="0"/>
                 <w:sz w:val="20"/>
+                <w:color w:val="242021"/>
               </w:rPr>
               <w:t>Ejecuta UAT y consolida observaciones.</w:t>
             </w:r>
@@ -3450,9 +3612,9 @@
         </w:trPr>
         <w:tc>
           <w:tcPr>
-            <w:tcW w:type="dxa" w:w="864"/>
+            <w:tcW w:type="dxa" w:w="852"/>
             <w:vAlign w:val="center"/>
-            <w:shd w:fill="F5F7F9"/>
+            <w:shd w:fill="F5F5F5"/>
             <w:tcMar>
               <w:top w:w="85" w:type="dxa"/>
               <w:left w:w="85" w:type="dxa"/>
@@ -3462,12 +3624,13 @@
           </w:tcPr>
           <w:p>
             <w:pPr>
-              <w:spacing w:after="40" w:before="40" w:line="240" w:lineRule="auto"/>
+              <w:spacing w:after="20" w:before="20" w:line="245" w:lineRule="auto"/>
             </w:pPr>
             <w:r>
               <w:rPr>
                 <w:b w:val="0"/>
                 <w:sz w:val="20"/>
+                <w:color w:val="242021"/>
               </w:rPr>
               <w:t>8</w:t>
             </w:r>
@@ -3475,9 +3638,9 @@
         </w:tc>
         <w:tc>
           <w:tcPr>
-            <w:tcW w:type="dxa" w:w="4680"/>
+            <w:tcW w:type="dxa" w:w="4613"/>
             <w:vAlign w:val="center"/>
-            <w:shd w:fill="F5F7F9"/>
+            <w:shd w:fill="F5F5F5"/>
             <w:tcMar>
               <w:top w:w="85" w:type="dxa"/>
               <w:left w:w="85" w:type="dxa"/>
@@ -3487,12 +3650,13 @@
           </w:tcPr>
           <w:p>
             <w:pPr>
-              <w:spacing w:after="40" w:before="40" w:line="240" w:lineRule="auto"/>
+              <w:spacing w:after="20" w:before="20" w:line="245" w:lineRule="auto"/>
             </w:pPr>
             <w:r>
               <w:rPr>
                 <w:b w:val="0"/>
                 <w:sz w:val="20"/>
+                <w:color w:val="242021"/>
               </w:rPr>
               <w:t>Correcciones finales, capacitación, despliegue y entrega formal.</w:t>
             </w:r>
@@ -3500,9 +3664,9 @@
         </w:tc>
         <w:tc>
           <w:tcPr>
-            <w:tcW w:type="dxa" w:w="4536"/>
+            <w:tcW w:type="dxa" w:w="4471"/>
             <w:vAlign w:val="center"/>
-            <w:shd w:fill="F5F7F9"/>
+            <w:shd w:fill="F5F5F5"/>
             <w:tcMar>
               <w:top w:w="85" w:type="dxa"/>
               <w:left w:w="85" w:type="dxa"/>
@@ -3512,12 +3676,13 @@
           </w:tcPr>
           <w:p>
             <w:pPr>
-              <w:spacing w:after="40" w:before="40" w:line="240" w:lineRule="auto"/>
+              <w:spacing w:after="20" w:before="20" w:line="245" w:lineRule="auto"/>
             </w:pPr>
             <w:r>
               <w:rPr>
                 <w:b w:val="0"/>
                 <w:sz w:val="20"/>
+                <w:color w:val="242021"/>
               </w:rPr>
               <w:t>Verifica operación y recibe entregables.</w:t>
             </w:r>
@@ -3653,8 +3818,8 @@
         </w:tblBorders>
       </w:tblPr>
       <w:tblGrid>
-        <w:gridCol w:w="2304"/>
-        <w:gridCol w:w="7776"/>
+        <w:gridCol w:w="2271"/>
+        <w:gridCol w:w="7665"/>
       </w:tblGrid>
       <w:tr>
         <w:trPr>
@@ -3663,24 +3828,28 @@
         </w:trPr>
         <w:tc>
           <w:tcPr>
-            <w:tcW w:type="dxa" w:w="2304"/>
+            <w:tcW w:type="dxa" w:w="2271"/>
             <w:vAlign w:val="center"/>
-            <w:shd w:fill="DCE6ED"/>
+            <w:shd w:fill="242021"/>
             <w:tcMar>
               <w:top w:w="85" w:type="dxa"/>
               <w:left w:w="85" w:type="dxa"/>
               <w:bottom w:w="85" w:type="dxa"/>
               <w:right w:w="85" w:type="dxa"/>
             </w:tcMar>
+            <w:tcBorders>
+              <w:bottom w:val="single" w:sz="8" w:color="FF0006"/>
+            </w:tcBorders>
           </w:tcPr>
           <w:p>
             <w:pPr>
-              <w:spacing w:after="40" w:before="40" w:line="240" w:lineRule="auto"/>
+              <w:spacing w:after="20" w:before="20" w:line="245" w:lineRule="auto"/>
             </w:pPr>
             <w:r>
               <w:rPr>
                 <w:b/>
                 <w:sz w:val="20"/>
+                <w:color w:val="FFFFFF"/>
               </w:rPr>
               <w:t>Frente</w:t>
             </w:r>
@@ -3688,24 +3857,28 @@
         </w:tc>
         <w:tc>
           <w:tcPr>
-            <w:tcW w:type="dxa" w:w="7776"/>
+            <w:tcW w:type="dxa" w:w="7665"/>
             <w:vAlign w:val="center"/>
-            <w:shd w:fill="DCE6ED"/>
+            <w:shd w:fill="242021"/>
             <w:tcMar>
               <w:top w:w="85" w:type="dxa"/>
               <w:left w:w="85" w:type="dxa"/>
               <w:bottom w:w="85" w:type="dxa"/>
               <w:right w:w="85" w:type="dxa"/>
             </w:tcMar>
+            <w:tcBorders>
+              <w:bottom w:val="single" w:sz="8" w:color="FF0006"/>
+            </w:tcBorders>
           </w:tcPr>
           <w:p>
             <w:pPr>
-              <w:spacing w:after="40" w:before="40" w:line="240" w:lineRule="auto"/>
+              <w:spacing w:after="20" w:before="20" w:line="245" w:lineRule="auto"/>
             </w:pPr>
             <w:r>
               <w:rPr>
                 <w:b/>
                 <w:sz w:val="20"/>
+                <w:color w:val="FFFFFF"/>
               </w:rPr>
               <w:t>Evidencia de aceptación</w:t>
             </w:r>
@@ -3718,7 +3891,7 @@
         </w:trPr>
         <w:tc>
           <w:tcPr>
-            <w:tcW w:type="dxa" w:w="2304"/>
+            <w:tcW w:type="dxa" w:w="2271"/>
             <w:vAlign w:val="center"/>
             <w:shd w:fill="FFFFFF"/>
             <w:tcMar>
@@ -3730,12 +3903,13 @@
           </w:tcPr>
           <w:p>
             <w:pPr>
-              <w:spacing w:after="40" w:before="40" w:line="240" w:lineRule="auto"/>
+              <w:spacing w:after="20" w:before="20" w:line="245" w:lineRule="auto"/>
             </w:pPr>
             <w:r>
               <w:rPr>
                 <w:b w:val="0"/>
                 <w:sz w:val="20"/>
+                <w:color w:val="242021"/>
               </w:rPr>
               <w:t>Recorrido integrado</w:t>
             </w:r>
@@ -3743,7 +3917,7 @@
         </w:tc>
         <w:tc>
           <w:tcPr>
-            <w:tcW w:type="dxa" w:w="7776"/>
+            <w:tcW w:type="dxa" w:w="7665"/>
             <w:vAlign w:val="center"/>
             <w:shd w:fill="FFFFFF"/>
             <w:tcMar>
@@ -3755,12 +3929,13 @@
           </w:tcPr>
           <w:p>
             <w:pPr>
-              <w:spacing w:after="40" w:before="40" w:line="240" w:lineRule="auto"/>
+              <w:spacing w:after="20" w:before="20" w:line="245" w:lineRule="auto"/>
             </w:pPr>
             <w:r>
               <w:rPr>
                 <w:b w:val="0"/>
                 <w:sz w:val="20"/>
+                <w:color w:val="242021"/>
               </w:rPr>
               <w:t>APEX envía un expediente, el motor lo analiza y APEX muestra resultados de la versión correcta.</w:t>
             </w:r>
@@ -3773,9 +3948,9 @@
         </w:trPr>
         <w:tc>
           <w:tcPr>
-            <w:tcW w:type="dxa" w:w="2304"/>
+            <w:tcW w:type="dxa" w:w="2271"/>
             <w:vAlign w:val="center"/>
-            <w:shd w:fill="F5F7F9"/>
+            <w:shd w:fill="F5F5F5"/>
             <w:tcMar>
               <w:top w:w="85" w:type="dxa"/>
               <w:left w:w="85" w:type="dxa"/>
@@ -3785,12 +3960,13 @@
           </w:tcPr>
           <w:p>
             <w:pPr>
-              <w:spacing w:after="40" w:before="40" w:line="240" w:lineRule="auto"/>
+              <w:spacing w:after="20" w:before="20" w:line="245" w:lineRule="auto"/>
             </w:pPr>
             <w:r>
               <w:rPr>
                 <w:b w:val="0"/>
                 <w:sz w:val="20"/>
+                <w:color w:val="242021"/>
               </w:rPr>
               <w:t>Análisis documental</w:t>
             </w:r>
@@ -3798,9 +3974,9 @@
         </w:tc>
         <w:tc>
           <w:tcPr>
-            <w:tcW w:type="dxa" w:w="7776"/>
+            <w:tcW w:type="dxa" w:w="7665"/>
             <w:vAlign w:val="center"/>
-            <w:shd w:fill="F5F7F9"/>
+            <w:shd w:fill="F5F5F5"/>
             <w:tcMar>
               <w:top w:w="85" w:type="dxa"/>
               <w:left w:w="85" w:type="dxa"/>
@@ -3810,12 +3986,13 @@
           </w:tcPr>
           <w:p>
             <w:pPr>
-              <w:spacing w:after="40" w:before="40" w:line="240" w:lineRule="auto"/>
+              <w:spacing w:after="20" w:before="20" w:line="245" w:lineRule="auto"/>
             </w:pPr>
             <w:r>
               <w:rPr>
                 <w:b w:val="0"/>
                 <w:sz w:val="20"/>
+                <w:color w:val="242021"/>
               </w:rPr>
               <w:t>Contraste de campos, faltantes, reglas y evidencia con el conjunto de referencia aprobado; documentos ilegibles o inciertos requieren revisión.</w:t>
             </w:r>
@@ -3828,7 +4005,7 @@
         </w:trPr>
         <w:tc>
           <w:tcPr>
-            <w:tcW w:type="dxa" w:w="2304"/>
+            <w:tcW w:type="dxa" w:w="2271"/>
             <w:vAlign w:val="center"/>
             <w:shd w:fill="FFFFFF"/>
             <w:tcMar>
@@ -3840,12 +4017,13 @@
           </w:tcPr>
           <w:p>
             <w:pPr>
-              <w:spacing w:after="40" w:before="40" w:line="240" w:lineRule="auto"/>
+              <w:spacing w:after="20" w:before="20" w:line="245" w:lineRule="auto"/>
             </w:pPr>
             <w:r>
               <w:rPr>
                 <w:b w:val="0"/>
                 <w:sz w:val="20"/>
+                <w:color w:val="242021"/>
               </w:rPr>
               <w:t>Autoadministración</w:t>
             </w:r>
@@ -3853,7 +4031,7 @@
         </w:tc>
         <w:tc>
           <w:tcPr>
-            <w:tcW w:type="dxa" w:w="7776"/>
+            <w:tcW w:type="dxa" w:w="7665"/>
             <w:vAlign w:val="center"/>
             <w:shd w:fill="FFFFFF"/>
             <w:tcMar>
@@ -3865,12 +4043,13 @@
           </w:tcPr>
           <w:p>
             <w:pPr>
-              <w:spacing w:after="40" w:before="40" w:line="240" w:lineRule="auto"/>
+              <w:spacing w:after="20" w:before="20" w:line="245" w:lineRule="auto"/>
             </w:pPr>
             <w:r>
               <w:rPr>
                 <w:b w:val="0"/>
                 <w:sz w:val="20"/>
+                <w:color w:val="242021"/>
               </w:rPr>
               <w:t>Un usuario autorizado modifica una regla, la prueba y publica desde el portal; un nuevo análisis la aplica y el anterior conserva su versión.</w:t>
             </w:r>
@@ -3883,9 +4062,9 @@
         </w:trPr>
         <w:tc>
           <w:tcPr>
-            <w:tcW w:type="dxa" w:w="2304"/>
+            <w:tcW w:type="dxa" w:w="2271"/>
             <w:vAlign w:val="center"/>
-            <w:shd w:fill="F5F7F9"/>
+            <w:shd w:fill="F5F5F5"/>
             <w:tcMar>
               <w:top w:w="85" w:type="dxa"/>
               <w:left w:w="85" w:type="dxa"/>
@@ -3895,12 +4074,13 @@
           </w:tcPr>
           <w:p>
             <w:pPr>
-              <w:spacing w:after="40" w:before="40" w:line="240" w:lineRule="auto"/>
+              <w:spacing w:after="20" w:before="20" w:line="245" w:lineRule="auto"/>
             </w:pPr>
             <w:r>
               <w:rPr>
                 <w:b w:val="0"/>
                 <w:sz w:val="20"/>
+                <w:color w:val="242021"/>
               </w:rPr>
               <w:t>Permisos y auditoría</w:t>
             </w:r>
@@ -3908,9 +4088,9 @@
         </w:tc>
         <w:tc>
           <w:tcPr>
-            <w:tcW w:type="dxa" w:w="7776"/>
+            <w:tcW w:type="dxa" w:w="7665"/>
             <w:vAlign w:val="center"/>
-            <w:shd w:fill="F5F7F9"/>
+            <w:shd w:fill="F5F5F5"/>
             <w:tcMar>
               <w:top w:w="85" w:type="dxa"/>
               <w:left w:w="85" w:type="dxa"/>
@@ -3920,12 +4100,13 @@
           </w:tcPr>
           <w:p>
             <w:pPr>
-              <w:spacing w:after="40" w:before="40" w:line="240" w:lineRule="auto"/>
+              <w:spacing w:after="20" w:before="20" w:line="245" w:lineRule="auto"/>
             </w:pPr>
             <w:r>
               <w:rPr>
                 <w:b w:val="0"/>
                 <w:sz w:val="20"/>
+                <w:color w:val="242021"/>
               </w:rPr>
               <w:t>Se bloquean acciones sin permiso y se registran edición, publicación y reproceso con usuario y fecha.</w:t>
             </w:r>
@@ -3938,7 +4119,7 @@
         </w:trPr>
         <w:tc>
           <w:tcPr>
-            <w:tcW w:type="dxa" w:w="2304"/>
+            <w:tcW w:type="dxa" w:w="2271"/>
             <w:vAlign w:val="center"/>
             <w:shd w:fill="FFFFFF"/>
             <w:tcMar>
@@ -3950,12 +4131,13 @@
           </w:tcPr>
           <w:p>
             <w:pPr>
-              <w:spacing w:after="40" w:before="40" w:line="240" w:lineRule="auto"/>
+              <w:spacing w:after="20" w:before="20" w:line="245" w:lineRule="auto"/>
             </w:pPr>
             <w:r>
               <w:rPr>
                 <w:b w:val="0"/>
                 <w:sz w:val="20"/>
+                <w:color w:val="242021"/>
               </w:rPr>
               <w:t>Errores y recuperación</w:t>
             </w:r>
@@ -3963,7 +4145,7 @@
         </w:tc>
         <w:tc>
           <w:tcPr>
-            <w:tcW w:type="dxa" w:w="7776"/>
+            <w:tcW w:type="dxa" w:w="7665"/>
             <w:vAlign w:val="center"/>
             <w:shd w:fill="FFFFFF"/>
             <w:tcMar>
@@ -3975,12 +4157,13 @@
           </w:tcPr>
           <w:p>
             <w:pPr>
-              <w:spacing w:after="40" w:before="40" w:line="240" w:lineRule="auto"/>
+              <w:spacing w:after="20" w:before="20" w:line="245" w:lineRule="auto"/>
             </w:pPr>
             <w:r>
               <w:rPr>
                 <w:b w:val="0"/>
                 <w:sz w:val="20"/>
+                <w:color w:val="242021"/>
               </w:rPr>
               <w:t>Duplicados, caída de Gemini, archivos inválidos y reintentos no producen aprobación implícita ni resultados asociados a otro expediente.</w:t>
             </w:r>
@@ -3993,9 +4176,9 @@
         </w:trPr>
         <w:tc>
           <w:tcPr>
-            <w:tcW w:type="dxa" w:w="2304"/>
+            <w:tcW w:type="dxa" w:w="2271"/>
             <w:vAlign w:val="center"/>
-            <w:shd w:fill="F5F7F9"/>
+            <w:shd w:fill="F5F5F5"/>
             <w:tcMar>
               <w:top w:w="85" w:type="dxa"/>
               <w:left w:w="85" w:type="dxa"/>
@@ -4005,12 +4188,13 @@
           </w:tcPr>
           <w:p>
             <w:pPr>
-              <w:spacing w:after="40" w:before="40" w:line="240" w:lineRule="auto"/>
+              <w:spacing w:after="20" w:before="20" w:line="245" w:lineRule="auto"/>
             </w:pPr>
             <w:r>
               <w:rPr>
                 <w:b w:val="0"/>
                 <w:sz w:val="20"/>
+                <w:color w:val="242021"/>
               </w:rPr>
               <w:t>Operación</w:t>
             </w:r>
@@ -4018,9 +4202,9 @@
         </w:tc>
         <w:tc>
           <w:tcPr>
-            <w:tcW w:type="dxa" w:w="7776"/>
+            <w:tcW w:type="dxa" w:w="7665"/>
             <w:vAlign w:val="center"/>
-            <w:shd w:fill="F5F7F9"/>
+            <w:shd w:fill="F5F5F5"/>
             <w:tcMar>
               <w:top w:w="85" w:type="dxa"/>
               <w:left w:w="85" w:type="dxa"/>
@@ -4030,12 +4214,13 @@
           </w:tcPr>
           <w:p>
             <w:pPr>
-              <w:spacing w:after="40" w:before="40" w:line="240" w:lineRule="auto"/>
+              <w:spacing w:after="20" w:before="20" w:line="245" w:lineRule="auto"/>
             </w:pPr>
             <w:r>
               <w:rPr>
                 <w:b w:val="0"/>
                 <w:sz w:val="20"/>
+                <w:color w:val="242021"/>
               </w:rPr>
               <w:t>Instalación verificada, documentación entregada y prueba conjunta de respaldo y recuperación conforme al acta técnica.</w:t>
             </w:r>
@@ -4230,9 +4415,10 @@
       </w:r>
     </w:p>
     <w:sectPr>
-      <w:footerReference w:type="default" r:id="rId9"/>
+      <w:headerReference w:type="default" r:id="rId9"/>
+      <w:footerReference w:type="default" r:id="rId10"/>
       <w:pgSz w:w="12240" w:h="15840"/>
-      <w:pgMar w:top="1008" w:right="1080" w:bottom="1008" w:left="1080" w:header="432" w:footer="432" w:gutter="0"/>
+      <w:pgMar w:top="1584" w:right="1152" w:bottom="979" w:left="1152" w:header="346" w:footer="432" w:gutter="0"/>
       <w:cols w:space="720"/>
       <w:docGrid w:linePitch="360"/>
     </w:sectPr>
@@ -4245,17 +4431,159 @@
   <w:p>
     <w:pPr>
       <w:pStyle w:val="Footer"/>
-      <w:jc w:val="right"/>
+      <w:tabs>
+        <w:tab w:pos="9936" w:val="right"/>
+      </w:tabs>
+      <w:spacing w:before="0" w:after="0"/>
+      <w:jc w:val="left"/>
+      <w:pBdr>
+        <w:top w:val="single" w:sz="4" w:space="7" w:color="D9D9D9"/>
+      </w:pBdr>
     </w:pPr>
     <w:r>
       <w:rPr>
-        <w:sz w:val="18"/>
-      </w:rPr>
-      <w:t xml:space="preserve">MACAO Solutions | AFP Occidente | v2.0 | </w:t>
+        <w:rFonts w:ascii="Calibri" w:hAnsi="Calibri"/>
+        <w:color w:val="666666"/>
+        <w:sz w:val="16"/>
+      </w:rPr>
+      <w:t>PROP AFP 2026 001  |  v2.0</w:t>
     </w:r>
-    <w:fldSimple w:instr="PAGE"/>
+    <w:r>
+      <w:rPr>
+        <w:rFonts w:ascii="Calibri" w:hAnsi="Calibri"/>
+        <w:color w:val="666666"/>
+        <w:sz w:val="16"/>
+      </w:rPr>
+      <w:tab/>
+    </w:r>
+    <w:fldSimple w:instr="PAGE">
+      <w:r>
+        <w:rPr>
+          <w:sz w:val="16"/>
+          <w:color w:val="666666"/>
+        </w:rPr>
+        <w:t>1</w:t>
+      </w:r>
+    </w:fldSimple>
+    <w:r>
+      <w:rPr>
+        <w:rFonts w:ascii="Calibri" w:hAnsi="Calibri"/>
+        <w:color w:val="666666"/>
+        <w:sz w:val="16"/>
+      </w:rPr>
+      <w:t xml:space="preserve"> / </w:t>
+    </w:r>
+    <w:fldSimple w:instr="NUMPAGES">
+      <w:r>
+        <w:rPr>
+          <w:sz w:val="16"/>
+          <w:color w:val="666666"/>
+        </w:rPr>
+        <w:t>1</w:t>
+      </w:r>
+    </w:fldSimple>
   </w:p>
 </w:ftr>
+</file>
+
+<file path=word/header1.xml><?xml version="1.0" encoding="utf-8"?>
+<w:hdr xmlns:m="http://schemas.openxmlformats.org/officeDocument/2006/math" xmlns:mc="http://schemas.openxmlformats.org/markup-compatibility/2006" xmlns:mo="http://schemas.microsoft.com/office/mac/office/2008/main" xmlns:mv="urn:schemas-microsoft-com:mac:vml" xmlns:o="urn:schemas-microsoft-com:office:office" xmlns:r="http://schemas.openxmlformats.org/officeDocument/2006/relationships" xmlns:v="urn:schemas-microsoft-com:vml" xmlns:w10="urn:schemas-microsoft-com:office:word" xmlns:w14="http://schemas.microsoft.com/office/word/2010/wordml" xmlns:w="http://schemas.openxmlformats.org/wordprocessingml/2006/main" xmlns:wne="http://schemas.microsoft.com/office/word/2006/wordml" xmlns:wp14="http://schemas.microsoft.com/office/word/2010/wordprocessingDrawing" xmlns:wp="http://schemas.openxmlformats.org/drawingml/2006/wordprocessingDrawing" xmlns:wpc="http://schemas.microsoft.com/office/word/2010/wordprocessingCanvas" xmlns:wpg="http://schemas.microsoft.com/office/word/2010/wordprocessingGroup" xmlns:wpi="http://schemas.microsoft.com/office/word/2010/wordprocessingInk" xmlns:wps="http://schemas.microsoft.com/office/word/2010/wordprocessingShape" mc:Ignorable="w14 wp14">
+  <w:p>
+    <w:pPr>
+      <w:pStyle w:val="Header"/>
+      <w:tabs>
+        <w:tab w:pos="979" w:val="left"/>
+        <w:tab w:pos="9936" w:val="right"/>
+      </w:tabs>
+      <w:spacing w:before="0" w:after="0" w:line="240" w:lineRule="auto"/>
+      <w:pBdr>
+        <w:bottom w:val="single" w:sz="8" w:space="5" w:color="FF0006"/>
+      </w:pBdr>
+    </w:pPr>
+    <w:r>
+      <w:drawing>
+        <wp:inline xmlns:a="http://schemas.openxmlformats.org/drawingml/2006/main" xmlns:pic="http://schemas.openxmlformats.org/drawingml/2006/picture">
+          <wp:extent cx="366677" cy="457200"/>
+          <wp:docPr id="1" name="Picture 1" descr="MACAO Solutions"/>
+          <wp:cNvGraphicFramePr>
+            <a:graphicFrameLocks noChangeAspect="1"/>
+          </wp:cNvGraphicFramePr>
+          <a:graphic>
+            <a:graphicData uri="http://schemas.openxmlformats.org/drawingml/2006/picture">
+              <pic:pic>
+                <pic:nvPicPr>
+                  <pic:cNvPr id="0" name="LogoMACAO.png"/>
+                  <pic:cNvPicPr/>
+                </pic:nvPicPr>
+                <pic:blipFill>
+                  <a:blip r:embed="rId1"/>
+                  <a:stretch>
+                    <a:fillRect/>
+                  </a:stretch>
+                </pic:blipFill>
+                <pic:spPr>
+                  <a:xfrm>
+                    <a:off x="0" y="0"/>
+                    <a:ext cx="366677" cy="457200"/>
+                  </a:xfrm>
+                  <a:prstGeom prst="rect"/>
+                </pic:spPr>
+              </pic:pic>
+            </a:graphicData>
+          </a:graphic>
+        </wp:inline>
+      </w:drawing>
+    </w:r>
+    <w:r>
+      <w:rPr>
+        <w:rFonts w:ascii="Calibri" w:hAnsi="Calibri"/>
+        <w:b/>
+        <w:color w:val="000000"/>
+        <w:sz w:val="18"/>
+        <w:position w:val="19"/>
+      </w:rPr>
+      <w:tab/>
+      <w:t>MACAO Solutions S. de R.L.</w:t>
+    </w:r>
+    <w:r>
+      <w:tab/>
+    </w:r>
+    <w:r>
+      <w:drawing>
+        <wp:inline xmlns:a="http://schemas.openxmlformats.org/drawingml/2006/main" xmlns:pic="http://schemas.openxmlformats.org/drawingml/2006/picture">
+          <wp:extent cx="1389888" cy="551817"/>
+          <wp:docPr id="2" name="Picture 2" descr="AFP Occidente"/>
+          <wp:cNvGraphicFramePr>
+            <a:graphicFrameLocks noChangeAspect="1"/>
+          </wp:cNvGraphicFramePr>
+          <a:graphic>
+            <a:graphicData uri="http://schemas.openxmlformats.org/drawingml/2006/picture">
+              <pic:pic>
+                <pic:nvPicPr>
+                  <pic:cNvPr id="0" name="afpc-occidente-logo.png"/>
+                  <pic:cNvPicPr/>
+                </pic:nvPicPr>
+                <pic:blipFill>
+                  <a:blip r:embed="rId2"/>
+                  <a:stretch>
+                    <a:fillRect/>
+                  </a:stretch>
+                </pic:blipFill>
+                <pic:spPr>
+                  <a:xfrm>
+                    <a:off x="0" y="0"/>
+                    <a:ext cx="1389888" cy="551817"/>
+                  </a:xfrm>
+                  <a:prstGeom prst="rect"/>
+                </pic:spPr>
+              </pic:pic>
+            </a:graphicData>
+          </a:graphic>
+        </wp:inline>
+      </w:drawing>
+    </w:r>
+  </w:p>
+</w:hdr>
 </file>
 
 <file path=word/numbering.xml><?xml version="1.0" encoding="utf-8"?>
@@ -4623,12 +4951,13 @@
     <w:rsid w:val="00FC693F"/>
     <w:pPr>
       <w:widowControl/>
-      <w:spacing w:after="140" w:line="254" w:lineRule="auto"/>
+      <w:spacing w:after="120" w:line="257" w:lineRule="auto"/>
     </w:pPr>
     <w:rPr>
       <w:rFonts w:ascii="Calibri" w:hAnsi="Calibri"/>
-      <w:color w:val="000000"/>
+      <w:color w:val="242021"/>
       <w:sz w:val="22"/>
+      <w:lang w:val="es-HN"/>
     </w:rPr>
   </w:style>
   <w:style w:type="paragraph" w:styleId="Header">
@@ -4639,12 +4968,11 @@
     <w:unhideWhenUsed/>
     <w:rsid w:val="00E618BF"/>
     <w:pPr>
-      <w:tabs>
-        <w:tab w:val="center" w:pos="4680"/>
-        <w:tab w:val="right" w:pos="9360"/>
-      </w:tabs>
       <w:spacing w:after="0" w:line="240" w:lineRule="auto"/>
     </w:pPr>
+    <w:rPr>
+      <w:sz w:val="16"/>
+    </w:rPr>
   </w:style>
   <w:style w:type="character" w:customStyle="1" w:styleId="HeaderChar">
     <w:name w:val="Header Char"/>
@@ -4661,12 +4989,11 @@
     <w:unhideWhenUsed/>
     <w:rsid w:val="00E618BF"/>
     <w:pPr>
-      <w:tabs>
-        <w:tab w:val="center" w:pos="4680"/>
-        <w:tab w:val="right" w:pos="9360"/>
-      </w:tabs>
       <w:spacing w:after="0" w:line="240" w:lineRule="auto"/>
     </w:pPr>
+    <w:rPr>
+      <w:sz w:val="16"/>
+    </w:rPr>
   </w:style>
   <w:style w:type="character" w:customStyle="1" w:styleId="FooterChar">
     <w:name w:val="Footer Char"/>
@@ -4686,7 +5013,7 @@
     <w:pPr>
       <w:keepNext/>
       <w:keepLines/>
-      <w:spacing w:before="200" w:after="140" w:line="254" w:lineRule="auto"/>
+      <w:spacing w:before="160" w:after="140" w:line="257" w:lineRule="auto"/>
       <w:outlineLvl w:val="0"/>
     </w:pPr>
     <w:rPr>
@@ -4694,7 +5021,7 @@
       <w:b/>
       <w:bCs/>
       <w:color w:val="000000"/>
-      <w:sz w:val="34"/>
+      <w:sz w:val="30"/>
       <w:szCs w:val="28"/>
     </w:rPr>
   </w:style>
@@ -4710,7 +5037,7 @@
     <w:pPr>
       <w:keepNext/>
       <w:keepLines/>
-      <w:spacing w:before="200" w:after="140" w:line="254" w:lineRule="auto"/>
+      <w:spacing w:before="160" w:after="140" w:line="257" w:lineRule="auto"/>
       <w:outlineLvl w:val="1"/>
     </w:pPr>
     <w:rPr>
@@ -4734,7 +5061,7 @@
     <w:pPr>
       <w:keepNext/>
       <w:keepLines/>
-      <w:spacing w:before="200" w:after="140" w:line="254" w:lineRule="auto"/>
+      <w:spacing w:before="200" w:after="0"/>
       <w:outlineLvl w:val="2"/>
     </w:pPr>
     <w:rPr>
@@ -4742,7 +5069,6 @@
       <w:b/>
       <w:bCs/>
       <w:color w:val="000000"/>
-      <w:sz w:val="22"/>
     </w:rPr>
   </w:style>
   <w:style w:type="paragraph" w:styleId="Heading4">
@@ -4974,16 +5300,15 @@
     <w:rsid w:val="00FC693F"/>
     <w:pPr>
       <w:keepNext/>
-      <w:spacing w:after="140" w:line="254" w:lineRule="auto" w:before="200"/>
+      <w:spacing w:after="120" w:line="257" w:lineRule="auto" w:before="0"/>
       <w:contextualSpacing/>
     </w:pPr>
     <w:rPr>
       <w:rFonts w:asciiTheme="majorHAnsi" w:eastAsiaTheme="majorEastAsia" w:hAnsiTheme="majorHAnsi" w:cstheme="majorBidi" w:ascii="Calibri" w:hAnsi="Calibri"/>
       <w:b/>
       <w:color w:val="000000"/>
-      <w:spacing w:val="5"/>
       <w:kern w:val="28"/>
-      <w:sz w:val="50"/>
+      <w:sz w:val="46"/>
       <w:szCs w:val="52"/>
     </w:rPr>
   </w:style>
@@ -4996,7 +5321,6 @@
     <w:rPr>
       <w:rFonts w:asciiTheme="majorHAnsi" w:eastAsiaTheme="majorEastAsia" w:hAnsiTheme="majorHAnsi" w:cstheme="majorBidi"/>
       <w:color w:val="17365D" w:themeColor="text2" w:themeShade="BF"/>
-      <w:spacing w:val="5"/>
       <w:kern w:val="28"/>
       <w:sz w:val="52"/>
       <w:szCs w:val="52"/>
@@ -5011,20 +5335,17 @@
     <w:qFormat/>
     <w:rsid w:val="00FC693F"/>
     <w:pPr>
-      <w:keepNext/>
       <w:numPr>
         <w:ilvl w:val="1"/>
       </w:numPr>
-      <w:spacing w:after="140" w:line="254" w:lineRule="auto" w:before="200"/>
+      <w:spacing w:after="120" w:line="257" w:lineRule="auto"/>
     </w:pPr>
     <w:rPr>
       <w:rFonts w:asciiTheme="majorHAnsi" w:eastAsiaTheme="majorEastAsia" w:hAnsiTheme="majorHAnsi" w:cstheme="majorBidi" w:ascii="Calibri" w:hAnsi="Calibri"/>
-      <w:b w:val="0"/>
-      <w:i/>
+      <w:i w:val="0"/>
       <w:iCs/>
       <w:color w:val="000000"/>
-      <w:spacing w:val="15"/>
-      <w:sz w:val="30"/>
+      <w:sz w:val="24"/>
       <w:szCs w:val="24"/>
     </w:rPr>
   </w:style>
@@ -5039,7 +5360,6 @@
       <w:i/>
       <w:iCs/>
       <w:color w:val="4F81BD" w:themeColor="accent1"/>
-      <w:spacing w:val="15"/>
       <w:sz w:val="24"/>
       <w:szCs w:val="24"/>
     </w:rPr>
@@ -5542,7 +5862,6 @@
       <w:bCs/>
       <w:smallCaps/>
       <w:color w:val="C0504D" w:themeColor="accent2"/>
-      <w:spacing w:val="5"/>
       <w:u w:val="single"/>
     </w:rPr>
   </w:style>
@@ -5556,7 +5875,6 @@
       <w:b/>
       <w:bCs/>
       <w:smallCaps/>
-      <w:spacing w:val="5"/>
     </w:rPr>
   </w:style>
   <w:style w:type="paragraph" w:styleId="TOCHeading">

</xml_diff>

<commit_message>
docs: precisar Gemini Flash-Lite y responsabilidad de actualización
</commit_message>
<xml_diff>
--- a/Propuestas/Formalizacion/Propuesta_Motor_Analisis_Portal_APEX_Occidente_v2.0.docx
+++ b/Propuestas/Formalizacion/Propuesta_Motor_Analisis_Portal_APEX_Occidente_v2.0.docx
@@ -1285,7 +1285,7 @@
         <w:pStyle w:val="ListBullet"/>
       </w:pPr>
       <w:r>
-        <w:t>Proyecto y facturación habilitados para API, modalidad autorizada de Gemini, modelo aprobado y credenciales de servicio; una suscripción de chat no sustituye el acceso por API.</w:t>
+        <w:t>Proyecto y facturación habilitados para API, acceso al modelo Gemini 3.5 Flash-Lite (gemini-3.5-flash-lite) y credenciales de servicio; una suscripción de chat no sustituye el acceso por API.</w:t>
       </w:r>
     </w:p>
     <w:p>
@@ -1302,6 +1302,11 @@
       </w:pPr>
       <w:r>
         <w:t>Autorización sobre datos y documentos a procesar, región y condiciones de retención. Aunque el motor opere localmente, el contenido enviado a Gemini se procesa en el servicio externo autorizado.</w:t>
+      </w:r>
+    </w:p>
+    <w:p>
+      <w:r>
+        <w:t>El banco será responsable de monitorear los avisos de deprecación o retiro del modelo por Google y mantener un modelo vigente, habilitando y coordinando su sustitución antes de la fecha de retiro. El reemplazo deberá validarse con el motor antes de producción. Las adaptaciones de software o pruebas adicionales que requieran intervención de MACAO se evaluarán y acordarán por escrito bajo soporte o control de cambios.</w:t>
       </w:r>
     </w:p>
     <w:p>
@@ -2420,7 +2425,7 @@
                 <w:sz w:val="20"/>
                 <w:color w:val="242021"/>
               </w:rPr>
-              <w:t>Habilita proyecto, cuotas y credenciales</w:t>
+              <w:t>Habilita proyecto, cuotas y credenciales; mantiene vigente el modelo</w:t>
             </w:r>
           </w:p>
         </w:tc>

</xml_diff>